<commit_message>
částečná úprava posílání cmd
</commit_message>
<xml_diff>
--- a/CVUT kit com spec.docx
+++ b/CVUT kit com spec.docx
@@ -9269,7 +9269,14 @@
                 <w:sz w:val="18"/>
                 <w:szCs w:val="18"/>
               </w:rPr>
-              <w:t>13</w:t>
+              <w:t>1</w:t>
+            </w:r>
+            <w:r>
+              <w:rPr>
+                <w:sz w:val="18"/>
+                <w:szCs w:val="18"/>
+              </w:rPr>
+              <w:t>4</w:t>
             </w:r>
           </w:p>
         </w:tc>

</xml_diff>

<commit_message>
device: stop sampling - oprava chybné on_ack; reset transmiter_sent_packets
</commit_message>
<xml_diff>
--- a/CVUT kit com spec.docx
+++ b/CVUT kit com spec.docx
@@ -8223,19 +8223,7 @@
               <w:rPr>
                 <w:szCs w:val="18"/>
               </w:rPr>
-              <w:t xml:space="preserve"> </w:t>
-            </w:r>
-            <w:r>
-              <w:rPr>
-                <w:szCs w:val="18"/>
-              </w:rPr>
-              <w:t xml:space="preserve">Response to </w:t>
-            </w:r>
-            <w:r>
-              <w:rPr>
-                <w:szCs w:val="18"/>
-              </w:rPr>
-              <w:t>Clock</w:t>
+              <w:t xml:space="preserve"> Response to Clock</w:t>
             </w:r>
             <w:r>
               <w:t xml:space="preserve"> config command</w:t>
@@ -10669,8 +10657,8 @@
         <w:pStyle w:val="Titulek"/>
         <w:keepNext/>
       </w:pPr>
-      <w:bookmarkStart w:id="8" w:name="_Ref198133166"/>
-      <w:bookmarkStart w:id="9" w:name="_Ref207023320"/>
+      <w:bookmarkStart w:id="8" w:name="_Ref207023320"/>
+      <w:bookmarkStart w:id="9" w:name="_Ref198133166"/>
       <w:r>
         <w:t xml:space="preserve">Table </w:t>
       </w:r>
@@ -10701,7 +10689,7 @@
       <w:r>
         <w:t xml:space="preserve"> receiver command</w:t>
       </w:r>
-      <w:bookmarkEnd w:id="9"/>
+      <w:bookmarkEnd w:id="8"/>
     </w:p>
     <w:tbl>
       <w:tblPr>
@@ -11340,7 +11328,7 @@
       <w:r>
         <w:t xml:space="preserve"> command</w:t>
       </w:r>
-      <w:bookmarkEnd w:id="8"/>
+      <w:bookmarkEnd w:id="9"/>
       <w:bookmarkEnd w:id="10"/>
     </w:p>
     <w:tbl>
@@ -14295,8 +14283,8 @@
         <w:pStyle w:val="Titulek"/>
         <w:keepNext/>
       </w:pPr>
-      <w:bookmarkStart w:id="15" w:name="_Ref205812249"/>
-      <w:bookmarkStart w:id="16" w:name="_Ref206073930"/>
+      <w:bookmarkStart w:id="15" w:name="_Ref206073930"/>
+      <w:bookmarkStart w:id="16" w:name="_Ref205812249"/>
       <w:r>
         <w:t xml:space="preserve">Table </w:t>
       </w:r>
@@ -14330,7 +14318,7 @@
       <w:r>
         <w:t>Clock config command</w:t>
       </w:r>
-      <w:bookmarkEnd w:id="16"/>
+      <w:bookmarkEnd w:id="15"/>
     </w:p>
     <w:tbl>
       <w:tblPr>
@@ -15077,7 +15065,7 @@
       <w:r>
         <w:t>cquisition state</w:t>
       </w:r>
-      <w:bookmarkEnd w:id="15"/>
+      <w:bookmarkEnd w:id="16"/>
       <w:bookmarkEnd w:id="17"/>
       <w:r>
         <w:t xml:space="preserve"> command</w:t>
@@ -19303,7 +19291,956 @@
           <w:szCs w:val="18"/>
         </w:rPr>
       </w:pPr>
+      <w:r>
+        <w:rPr>
+          <w:b/>
+          <w:bCs/>
+          <w:szCs w:val="18"/>
+        </w:rPr>
+        <w:br w:type="page"/>
+      </w:r>
     </w:p>
+    <w:p>
+      <w:pPr>
+        <w:pStyle w:val="Nadpis1"/>
+      </w:pPr>
+      <w:r>
+        <w:lastRenderedPageBreak/>
+        <w:t>Gui</w:t>
+      </w:r>
+    </w:p>
+    <w:p/>
+    <w:tbl>
+      <w:tblPr>
+        <w:tblStyle w:val="Mkatabulky"/>
+        <w:tblW w:w="0" w:type="auto"/>
+        <w:tblLook w:val="04A0" w:firstRow="1" w:lastRow="0" w:firstColumn="1" w:lastColumn="0" w:noHBand="0" w:noVBand="1"/>
+      </w:tblPr>
+      <w:tblGrid>
+        <w:gridCol w:w="1501"/>
+        <w:gridCol w:w="752"/>
+        <w:gridCol w:w="750"/>
+        <w:gridCol w:w="1504"/>
+        <w:gridCol w:w="1503"/>
+        <w:gridCol w:w="751"/>
+        <w:gridCol w:w="752"/>
+        <w:gridCol w:w="1503"/>
+      </w:tblGrid>
+      <w:tr>
+        <w:tc>
+          <w:tcPr>
+            <w:tcW w:w="9016" w:type="dxa"/>
+            <w:gridSpan w:val="8"/>
+            <w:vAlign w:val="center"/>
+          </w:tcPr>
+          <w:p>
+            <w:pPr>
+              <w:jc w:val="center"/>
+              <w:rPr>
+                <w:b/>
+                <w:bCs/>
+                <w:szCs w:val="18"/>
+              </w:rPr>
+            </w:pPr>
+            <w:r>
+              <w:rPr>
+                <w:b/>
+                <w:bCs/>
+                <w:szCs w:val="18"/>
+              </w:rPr>
+              <w:t>GRAF</w:t>
+            </w:r>
+          </w:p>
+        </w:tc>
+      </w:tr>
+      <w:tr>
+        <w:tc>
+          <w:tcPr>
+            <w:tcW w:w="1501" w:type="dxa"/>
+          </w:tcPr>
+          <w:p>
+            <w:pPr>
+              <w:rPr>
+                <w:b/>
+                <w:bCs/>
+                <w:szCs w:val="18"/>
+              </w:rPr>
+            </w:pPr>
+            <w:r>
+              <w:rPr>
+                <w:b/>
+                <w:bCs/>
+                <w:szCs w:val="18"/>
+              </w:rPr>
+              <w:t>Error data</w:t>
+            </w:r>
+          </w:p>
+        </w:tc>
+        <w:tc>
+          <w:tcPr>
+            <w:tcW w:w="1502" w:type="dxa"/>
+            <w:gridSpan w:val="2"/>
+          </w:tcPr>
+          <w:p>
+            <w:pPr>
+              <w:rPr>
+                <w:b/>
+                <w:bCs/>
+                <w:szCs w:val="18"/>
+              </w:rPr>
+            </w:pPr>
+            <w:r>
+              <w:rPr>
+                <w:b/>
+                <w:bCs/>
+                <w:szCs w:val="18"/>
+              </w:rPr>
+              <w:t>X range</w:t>
+            </w:r>
+          </w:p>
+        </w:tc>
+        <w:tc>
+          <w:tcPr>
+            <w:tcW w:w="1504" w:type="dxa"/>
+          </w:tcPr>
+          <w:p>
+            <w:pPr>
+              <w:rPr>
+                <w:b/>
+                <w:bCs/>
+                <w:szCs w:val="18"/>
+              </w:rPr>
+            </w:pPr>
+            <w:r>
+              <w:rPr>
+                <w:b/>
+                <w:bCs/>
+                <w:szCs w:val="18"/>
+              </w:rPr>
+              <w:t>Y min</w:t>
+            </w:r>
+          </w:p>
+        </w:tc>
+        <w:tc>
+          <w:tcPr>
+            <w:tcW w:w="1503" w:type="dxa"/>
+          </w:tcPr>
+          <w:p>
+            <w:pPr>
+              <w:rPr>
+                <w:b/>
+                <w:bCs/>
+                <w:szCs w:val="18"/>
+              </w:rPr>
+            </w:pPr>
+            <w:r>
+              <w:rPr>
+                <w:b/>
+                <w:bCs/>
+                <w:szCs w:val="18"/>
+              </w:rPr>
+              <w:t>Y max</w:t>
+            </w:r>
+          </w:p>
+        </w:tc>
+        <w:tc>
+          <w:tcPr>
+            <w:tcW w:w="1503" w:type="dxa"/>
+            <w:gridSpan w:val="2"/>
+          </w:tcPr>
+          <w:p>
+            <w:pPr>
+              <w:rPr>
+                <w:b/>
+                <w:bCs/>
+                <w:szCs w:val="18"/>
+              </w:rPr>
+            </w:pPr>
+            <w:r>
+              <w:rPr>
+                <w:b/>
+                <w:bCs/>
+                <w:szCs w:val="18"/>
+              </w:rPr>
+              <w:t>Auto range</w:t>
+            </w:r>
+          </w:p>
+        </w:tc>
+        <w:tc>
+          <w:tcPr>
+            <w:tcW w:w="1503" w:type="dxa"/>
+          </w:tcPr>
+          <w:p>
+            <w:pPr>
+              <w:rPr>
+                <w:b/>
+                <w:bCs/>
+                <w:szCs w:val="18"/>
+              </w:rPr>
+            </w:pPr>
+            <w:r>
+              <w:rPr>
+                <w:b/>
+                <w:bCs/>
+                <w:szCs w:val="18"/>
+              </w:rPr>
+              <w:t>clean</w:t>
+            </w:r>
+          </w:p>
+        </w:tc>
+      </w:tr>
+      <w:tr>
+        <w:trPr>
+          <w:trHeight w:val="188"/>
+        </w:trPr>
+        <w:tc>
+          <w:tcPr>
+            <w:tcW w:w="2253" w:type="dxa"/>
+            <w:gridSpan w:val="2"/>
+          </w:tcPr>
+          <w:p>
+            <w:pPr>
+              <w:rPr>
+                <w:b/>
+                <w:bCs/>
+                <w:szCs w:val="18"/>
+              </w:rPr>
+            </w:pPr>
+            <w:proofErr w:type="spellStart"/>
+            <w:r>
+              <w:rPr>
+                <w:b/>
+                <w:bCs/>
+                <w:szCs w:val="18"/>
+              </w:rPr>
+              <w:t>Adresa</w:t>
+            </w:r>
+            <w:proofErr w:type="spellEnd"/>
+            <w:r>
+              <w:rPr>
+                <w:b/>
+                <w:bCs/>
+                <w:szCs w:val="18"/>
+              </w:rPr>
+              <w:t xml:space="preserve"> </w:t>
+            </w:r>
+            <w:proofErr w:type="spellStart"/>
+            <w:r>
+              <w:rPr>
+                <w:b/>
+                <w:bCs/>
+                <w:szCs w:val="18"/>
+              </w:rPr>
+              <w:t>generátoru</w:t>
+            </w:r>
+            <w:proofErr w:type="spellEnd"/>
+            <w:r>
+              <w:rPr>
+                <w:b/>
+                <w:bCs/>
+                <w:szCs w:val="18"/>
+              </w:rPr>
+              <w:t xml:space="preserve"> </w:t>
+            </w:r>
+            <w:proofErr w:type="spellStart"/>
+            <w:r>
+              <w:rPr>
+                <w:b/>
+                <w:bCs/>
+                <w:szCs w:val="18"/>
+              </w:rPr>
+              <w:t>taxtové</w:t>
+            </w:r>
+            <w:proofErr w:type="spellEnd"/>
+            <w:r>
+              <w:rPr>
+                <w:b/>
+                <w:bCs/>
+                <w:szCs w:val="18"/>
+              </w:rPr>
+              <w:t xml:space="preserve"> pole</w:t>
+            </w:r>
+          </w:p>
+        </w:tc>
+        <w:tc>
+          <w:tcPr>
+            <w:tcW w:w="2254" w:type="dxa"/>
+            <w:gridSpan w:val="2"/>
+          </w:tcPr>
+          <w:p>
+            <w:pPr>
+              <w:rPr>
+                <w:b/>
+                <w:bCs/>
+                <w:szCs w:val="18"/>
+              </w:rPr>
+            </w:pPr>
+            <w:r>
+              <w:rPr>
+                <w:b/>
+                <w:bCs/>
+                <w:szCs w:val="18"/>
+              </w:rPr>
+              <w:t>GET ID</w:t>
+            </w:r>
+          </w:p>
+        </w:tc>
+        <w:tc>
+          <w:tcPr>
+            <w:tcW w:w="2254" w:type="dxa"/>
+            <w:gridSpan w:val="2"/>
+          </w:tcPr>
+          <w:p>
+            <w:pPr>
+              <w:rPr>
+                <w:b/>
+                <w:bCs/>
+                <w:szCs w:val="18"/>
+              </w:rPr>
+            </w:pPr>
+            <w:r>
+              <w:rPr>
+                <w:b/>
+                <w:bCs/>
+                <w:szCs w:val="18"/>
+              </w:rPr>
+              <w:t>Save data</w:t>
+            </w:r>
+          </w:p>
+        </w:tc>
+        <w:tc>
+          <w:tcPr>
+            <w:tcW w:w="2255" w:type="dxa"/>
+            <w:gridSpan w:val="2"/>
+            <w:vMerge w:val="restart"/>
+          </w:tcPr>
+          <w:p>
+            <w:pPr>
+              <w:rPr>
+                <w:b/>
+                <w:bCs/>
+                <w:szCs w:val="18"/>
+              </w:rPr>
+            </w:pPr>
+            <w:proofErr w:type="spellStart"/>
+            <w:r>
+              <w:rPr>
+                <w:b/>
+                <w:bCs/>
+                <w:szCs w:val="18"/>
+              </w:rPr>
+              <w:t>Systémové</w:t>
+            </w:r>
+            <w:proofErr w:type="spellEnd"/>
+            <w:r>
+              <w:rPr>
+                <w:b/>
+                <w:bCs/>
+                <w:szCs w:val="18"/>
+              </w:rPr>
+              <w:t xml:space="preserve"> </w:t>
+            </w:r>
+            <w:proofErr w:type="spellStart"/>
+            <w:r>
+              <w:rPr>
+                <w:b/>
+                <w:bCs/>
+                <w:szCs w:val="18"/>
+              </w:rPr>
+              <w:t>zprávy</w:t>
+            </w:r>
+            <w:proofErr w:type="spellEnd"/>
+          </w:p>
+        </w:tc>
+      </w:tr>
+      <w:tr>
+        <w:trPr>
+          <w:trHeight w:val="183"/>
+        </w:trPr>
+        <w:tc>
+          <w:tcPr>
+            <w:tcW w:w="2253" w:type="dxa"/>
+            <w:gridSpan w:val="2"/>
+          </w:tcPr>
+          <w:p>
+            <w:pPr>
+              <w:rPr>
+                <w:b/>
+                <w:bCs/>
+                <w:szCs w:val="18"/>
+              </w:rPr>
+            </w:pPr>
+            <w:proofErr w:type="spellStart"/>
+            <w:r>
+              <w:rPr>
+                <w:b/>
+                <w:bCs/>
+                <w:szCs w:val="18"/>
+              </w:rPr>
+              <w:t>Potvrdit</w:t>
+            </w:r>
+            <w:proofErr w:type="spellEnd"/>
+          </w:p>
+        </w:tc>
+        <w:tc>
+          <w:tcPr>
+            <w:tcW w:w="2254" w:type="dxa"/>
+            <w:gridSpan w:val="2"/>
+          </w:tcPr>
+          <w:p>
+            <w:pPr>
+              <w:rPr>
+                <w:b/>
+                <w:bCs/>
+                <w:szCs w:val="18"/>
+              </w:rPr>
+            </w:pPr>
+            <w:proofErr w:type="spellStart"/>
+            <w:r>
+              <w:rPr>
+                <w:b/>
+                <w:bCs/>
+                <w:szCs w:val="18"/>
+              </w:rPr>
+              <w:t>Registrer</w:t>
+            </w:r>
+            <w:proofErr w:type="spellEnd"/>
+            <w:r>
+              <w:rPr>
+                <w:b/>
+                <w:bCs/>
+                <w:szCs w:val="18"/>
+              </w:rPr>
+              <w:t xml:space="preserve"> receiver </w:t>
+            </w:r>
+            <w:proofErr w:type="spellStart"/>
+            <w:r>
+              <w:rPr>
+                <w:b/>
+                <w:bCs/>
+                <w:szCs w:val="18"/>
+              </w:rPr>
+              <w:t>textové</w:t>
+            </w:r>
+            <w:proofErr w:type="spellEnd"/>
+            <w:r>
+              <w:rPr>
+                <w:b/>
+                <w:bCs/>
+                <w:szCs w:val="18"/>
+              </w:rPr>
+              <w:t xml:space="preserve"> pole</w:t>
+            </w:r>
+          </w:p>
+        </w:tc>
+        <w:tc>
+          <w:tcPr>
+            <w:tcW w:w="2254" w:type="dxa"/>
+            <w:gridSpan w:val="2"/>
+          </w:tcPr>
+          <w:p>
+            <w:pPr>
+              <w:rPr>
+                <w:b/>
+                <w:bCs/>
+                <w:szCs w:val="18"/>
+              </w:rPr>
+            </w:pPr>
+            <w:proofErr w:type="spellStart"/>
+            <w:r>
+              <w:rPr>
+                <w:b/>
+                <w:bCs/>
+                <w:szCs w:val="18"/>
+              </w:rPr>
+              <w:t>Výpis</w:t>
+            </w:r>
+            <w:proofErr w:type="spellEnd"/>
+            <w:r>
+              <w:rPr>
+                <w:b/>
+                <w:bCs/>
+                <w:szCs w:val="18"/>
+              </w:rPr>
+              <w:t xml:space="preserve"> </w:t>
+            </w:r>
+            <w:proofErr w:type="spellStart"/>
+            <w:r>
+              <w:rPr>
+                <w:b/>
+                <w:bCs/>
+                <w:szCs w:val="18"/>
+              </w:rPr>
+              <w:t>cesty</w:t>
+            </w:r>
+            <w:proofErr w:type="spellEnd"/>
+            <w:r>
+              <w:rPr>
+                <w:b/>
+                <w:bCs/>
+                <w:szCs w:val="18"/>
+              </w:rPr>
+              <w:t xml:space="preserve"> </w:t>
+            </w:r>
+            <w:proofErr w:type="spellStart"/>
+            <w:r>
+              <w:rPr>
+                <w:b/>
+                <w:bCs/>
+                <w:szCs w:val="18"/>
+              </w:rPr>
+              <w:t>kam</w:t>
+            </w:r>
+            <w:proofErr w:type="spellEnd"/>
+            <w:r>
+              <w:rPr>
+                <w:b/>
+                <w:bCs/>
+                <w:szCs w:val="18"/>
+              </w:rPr>
+              <w:t xml:space="preserve"> </w:t>
+            </w:r>
+            <w:proofErr w:type="spellStart"/>
+            <w:r>
+              <w:rPr>
+                <w:b/>
+                <w:bCs/>
+                <w:szCs w:val="18"/>
+              </w:rPr>
+              <w:t>ukládám</w:t>
+            </w:r>
+            <w:proofErr w:type="spellEnd"/>
+          </w:p>
+        </w:tc>
+        <w:tc>
+          <w:tcPr>
+            <w:tcW w:w="2255" w:type="dxa"/>
+            <w:gridSpan w:val="2"/>
+            <w:vMerge/>
+          </w:tcPr>
+          <w:p>
+            <w:pPr>
+              <w:rPr>
+                <w:b/>
+                <w:bCs/>
+                <w:szCs w:val="18"/>
+              </w:rPr>
+            </w:pPr>
+          </w:p>
+        </w:tc>
+      </w:tr>
+      <w:tr>
+        <w:trPr>
+          <w:trHeight w:val="183"/>
+        </w:trPr>
+        <w:tc>
+          <w:tcPr>
+            <w:tcW w:w="2253" w:type="dxa"/>
+            <w:gridSpan w:val="2"/>
+          </w:tcPr>
+          <w:p>
+            <w:pPr>
+              <w:rPr>
+                <w:b/>
+                <w:bCs/>
+                <w:szCs w:val="18"/>
+              </w:rPr>
+            </w:pPr>
+            <w:proofErr w:type="spellStart"/>
+            <w:r>
+              <w:rPr>
+                <w:b/>
+                <w:bCs/>
+                <w:szCs w:val="18"/>
+              </w:rPr>
+              <w:t>Adresa</w:t>
+            </w:r>
+            <w:proofErr w:type="spellEnd"/>
+            <w:r>
+              <w:rPr>
+                <w:b/>
+                <w:bCs/>
+                <w:szCs w:val="18"/>
+              </w:rPr>
+              <w:t xml:space="preserve"> </w:t>
+            </w:r>
+            <w:proofErr w:type="spellStart"/>
+            <w:r>
+              <w:rPr>
+                <w:b/>
+                <w:bCs/>
+                <w:szCs w:val="18"/>
+              </w:rPr>
+              <w:t>klienta</w:t>
+            </w:r>
+            <w:proofErr w:type="spellEnd"/>
+            <w:r>
+              <w:rPr>
+                <w:b/>
+                <w:bCs/>
+                <w:szCs w:val="18"/>
+              </w:rPr>
+              <w:t xml:space="preserve"> </w:t>
+            </w:r>
+            <w:proofErr w:type="spellStart"/>
+            <w:r>
+              <w:rPr>
+                <w:b/>
+                <w:bCs/>
+                <w:szCs w:val="18"/>
+              </w:rPr>
+              <w:t>textové</w:t>
+            </w:r>
+            <w:proofErr w:type="spellEnd"/>
+            <w:r>
+              <w:rPr>
+                <w:b/>
+                <w:bCs/>
+                <w:szCs w:val="18"/>
+              </w:rPr>
+              <w:t xml:space="preserve"> pole</w:t>
+            </w:r>
+          </w:p>
+        </w:tc>
+        <w:tc>
+          <w:tcPr>
+            <w:tcW w:w="2254" w:type="dxa"/>
+            <w:gridSpan w:val="2"/>
+          </w:tcPr>
+          <w:p>
+            <w:pPr>
+              <w:rPr>
+                <w:b/>
+                <w:bCs/>
+                <w:szCs w:val="18"/>
+              </w:rPr>
+            </w:pPr>
+            <w:r>
+              <w:rPr>
+                <w:b/>
+                <w:bCs/>
+                <w:szCs w:val="18"/>
+              </w:rPr>
+              <w:t>Register receiver</w:t>
+            </w:r>
+          </w:p>
+        </w:tc>
+        <w:tc>
+          <w:tcPr>
+            <w:tcW w:w="2254" w:type="dxa"/>
+            <w:gridSpan w:val="2"/>
+          </w:tcPr>
+          <w:p>
+            <w:pPr>
+              <w:rPr>
+                <w:b/>
+                <w:bCs/>
+                <w:szCs w:val="18"/>
+              </w:rPr>
+            </w:pPr>
+            <w:r>
+              <w:rPr>
+                <w:b/>
+                <w:bCs/>
+                <w:szCs w:val="18"/>
+              </w:rPr>
+              <w:t>Start sampling</w:t>
+            </w:r>
+          </w:p>
+        </w:tc>
+        <w:tc>
+          <w:tcPr>
+            <w:tcW w:w="2255" w:type="dxa"/>
+            <w:gridSpan w:val="2"/>
+            <w:vMerge/>
+          </w:tcPr>
+          <w:p>
+            <w:pPr>
+              <w:rPr>
+                <w:b/>
+                <w:bCs/>
+                <w:szCs w:val="18"/>
+              </w:rPr>
+            </w:pPr>
+          </w:p>
+        </w:tc>
+      </w:tr>
+      <w:tr>
+        <w:trPr>
+          <w:trHeight w:val="183"/>
+        </w:trPr>
+        <w:tc>
+          <w:tcPr>
+            <w:tcW w:w="2253" w:type="dxa"/>
+            <w:gridSpan w:val="2"/>
+          </w:tcPr>
+          <w:p>
+            <w:pPr>
+              <w:rPr>
+                <w:b/>
+                <w:bCs/>
+                <w:szCs w:val="18"/>
+              </w:rPr>
+            </w:pPr>
+            <w:proofErr w:type="spellStart"/>
+            <w:r>
+              <w:rPr>
+                <w:b/>
+                <w:bCs/>
+                <w:szCs w:val="18"/>
+              </w:rPr>
+              <w:t>Potvrdit</w:t>
+            </w:r>
+            <w:proofErr w:type="spellEnd"/>
+          </w:p>
+        </w:tc>
+        <w:tc>
+          <w:tcPr>
+            <w:tcW w:w="2254" w:type="dxa"/>
+            <w:gridSpan w:val="2"/>
+          </w:tcPr>
+          <w:p>
+            <w:pPr>
+              <w:rPr>
+                <w:b/>
+                <w:bCs/>
+                <w:szCs w:val="18"/>
+              </w:rPr>
+            </w:pPr>
+            <w:r>
+              <w:rPr>
+                <w:b/>
+                <w:bCs/>
+                <w:szCs w:val="18"/>
+              </w:rPr>
+              <w:t xml:space="preserve">Remove receiver </w:t>
+            </w:r>
+            <w:proofErr w:type="spellStart"/>
+            <w:r>
+              <w:rPr>
+                <w:b/>
+                <w:bCs/>
+                <w:szCs w:val="18"/>
+              </w:rPr>
+              <w:t>textové</w:t>
+            </w:r>
+            <w:proofErr w:type="spellEnd"/>
+            <w:r>
+              <w:rPr>
+                <w:b/>
+                <w:bCs/>
+                <w:szCs w:val="18"/>
+              </w:rPr>
+              <w:t xml:space="preserve"> pole</w:t>
+            </w:r>
+          </w:p>
+        </w:tc>
+        <w:tc>
+          <w:tcPr>
+            <w:tcW w:w="2254" w:type="dxa"/>
+            <w:gridSpan w:val="2"/>
+          </w:tcPr>
+          <w:p>
+            <w:pPr>
+              <w:rPr>
+                <w:b/>
+                <w:bCs/>
+                <w:szCs w:val="18"/>
+              </w:rPr>
+            </w:pPr>
+            <w:r>
+              <w:rPr>
+                <w:b/>
+                <w:bCs/>
+                <w:szCs w:val="18"/>
+              </w:rPr>
+              <w:t>Start sampling on trigger</w:t>
+            </w:r>
+          </w:p>
+        </w:tc>
+        <w:tc>
+          <w:tcPr>
+            <w:tcW w:w="2255" w:type="dxa"/>
+            <w:gridSpan w:val="2"/>
+            <w:vMerge/>
+          </w:tcPr>
+          <w:p>
+            <w:pPr>
+              <w:rPr>
+                <w:b/>
+                <w:bCs/>
+                <w:szCs w:val="18"/>
+              </w:rPr>
+            </w:pPr>
+          </w:p>
+        </w:tc>
+      </w:tr>
+      <w:tr>
+        <w:trPr>
+          <w:trHeight w:val="183"/>
+        </w:trPr>
+        <w:tc>
+          <w:tcPr>
+            <w:tcW w:w="2253" w:type="dxa"/>
+            <w:gridSpan w:val="2"/>
+          </w:tcPr>
+          <w:p>
+            <w:pPr>
+              <w:rPr>
+                <w:b/>
+                <w:bCs/>
+                <w:szCs w:val="18"/>
+              </w:rPr>
+            </w:pPr>
+            <w:r>
+              <w:rPr>
+                <w:b/>
+                <w:bCs/>
+                <w:szCs w:val="18"/>
+              </w:rPr>
+              <w:t>PING</w:t>
+            </w:r>
+          </w:p>
+        </w:tc>
+        <w:tc>
+          <w:tcPr>
+            <w:tcW w:w="2254" w:type="dxa"/>
+            <w:gridSpan w:val="2"/>
+          </w:tcPr>
+          <w:p>
+            <w:pPr>
+              <w:rPr>
+                <w:b/>
+                <w:bCs/>
+                <w:szCs w:val="18"/>
+              </w:rPr>
+            </w:pPr>
+            <w:r>
+              <w:rPr>
+                <w:b/>
+                <w:bCs/>
+                <w:szCs w:val="18"/>
+              </w:rPr>
+              <w:t>Remove receiver</w:t>
+            </w:r>
+          </w:p>
+        </w:tc>
+        <w:tc>
+          <w:tcPr>
+            <w:tcW w:w="2254" w:type="dxa"/>
+            <w:gridSpan w:val="2"/>
+          </w:tcPr>
+          <w:p>
+            <w:pPr>
+              <w:rPr>
+                <w:b/>
+                <w:bCs/>
+                <w:szCs w:val="18"/>
+              </w:rPr>
+            </w:pPr>
+            <w:r>
+              <w:rPr>
+                <w:b/>
+                <w:bCs/>
+                <w:szCs w:val="18"/>
+              </w:rPr>
+              <w:t>Stop sampling</w:t>
+            </w:r>
+          </w:p>
+        </w:tc>
+        <w:tc>
+          <w:tcPr>
+            <w:tcW w:w="2255" w:type="dxa"/>
+            <w:gridSpan w:val="2"/>
+            <w:vMerge/>
+          </w:tcPr>
+          <w:p>
+            <w:pPr>
+              <w:rPr>
+                <w:b/>
+                <w:bCs/>
+                <w:szCs w:val="18"/>
+              </w:rPr>
+            </w:pPr>
+          </w:p>
+        </w:tc>
+      </w:tr>
+      <w:tr>
+        <w:trPr>
+          <w:trHeight w:val="183"/>
+        </w:trPr>
+        <w:tc>
+          <w:tcPr>
+            <w:tcW w:w="2253" w:type="dxa"/>
+            <w:gridSpan w:val="2"/>
+          </w:tcPr>
+          <w:p>
+            <w:pPr>
+              <w:rPr>
+                <w:b/>
+                <w:bCs/>
+                <w:szCs w:val="18"/>
+              </w:rPr>
+            </w:pPr>
+          </w:p>
+        </w:tc>
+        <w:tc>
+          <w:tcPr>
+            <w:tcW w:w="2254" w:type="dxa"/>
+            <w:gridSpan w:val="2"/>
+          </w:tcPr>
+          <w:p>
+            <w:pPr>
+              <w:rPr>
+                <w:b/>
+                <w:bCs/>
+                <w:szCs w:val="18"/>
+              </w:rPr>
+            </w:pPr>
+            <w:r>
+              <w:rPr>
+                <w:b/>
+                <w:bCs/>
+                <w:szCs w:val="18"/>
+              </w:rPr>
+              <w:t>Get receivers</w:t>
+            </w:r>
+          </w:p>
+        </w:tc>
+        <w:tc>
+          <w:tcPr>
+            <w:tcW w:w="2254" w:type="dxa"/>
+            <w:gridSpan w:val="2"/>
+          </w:tcPr>
+          <w:p>
+            <w:pPr>
+              <w:rPr>
+                <w:b/>
+                <w:bCs/>
+                <w:szCs w:val="18"/>
+              </w:rPr>
+            </w:pPr>
+          </w:p>
+        </w:tc>
+        <w:tc>
+          <w:tcPr>
+            <w:tcW w:w="2255" w:type="dxa"/>
+            <w:gridSpan w:val="2"/>
+            <w:vMerge/>
+          </w:tcPr>
+          <w:p>
+            <w:pPr>
+              <w:rPr>
+                <w:b/>
+                <w:bCs/>
+                <w:szCs w:val="18"/>
+              </w:rPr>
+            </w:pPr>
+          </w:p>
+        </w:tc>
+      </w:tr>
+    </w:tbl>
+    <w:p/>
     <w:sectPr>
       <w:pgSz w:w="11906" w:h="16838"/>
       <w:pgMar w:top="1440" w:right="1080" w:bottom="1440" w:left="1080" w:header="708" w:footer="708" w:gutter="0"/>
@@ -19312,6 +20249,10 @@
     </w:sectPr>
   </w:body>
 </w:document>
+</file>
+
+<file path=word/numbering.xml><?xml version="1.0" encoding="utf-8"?>
+<w:numbering xmlns:wpc="http://schemas.microsoft.com/office/word/2010/wordprocessingCanvas" xmlns:cx="http://schemas.microsoft.com/office/drawing/2014/chartex" xmlns:cx1="http://schemas.microsoft.com/office/drawing/2015/9/8/chartex" xmlns:cx2="http://schemas.microsoft.com/office/drawing/2015/10/21/chartex" xmlns:cx3="http://schemas.microsoft.com/office/drawing/2016/5/9/chartex" xmlns:cx4="http://schemas.microsoft.com/office/drawing/2016/5/10/chartex" xmlns:cx5="http://schemas.microsoft.com/office/drawing/2016/5/11/chartex" xmlns:cx6="http://schemas.microsoft.com/office/drawing/2016/5/12/chartex" xmlns:cx7="http://schemas.microsoft.com/office/drawing/2016/5/13/chartex" xmlns:cx8="http://schemas.microsoft.com/office/drawing/2016/5/14/chartex" xmlns:mc="http://schemas.openxmlformats.org/markup-compatibility/2006" xmlns:aink="http://schemas.microsoft.com/office/drawing/2016/ink" xmlns:am3d="http://schemas.microsoft.com/office/drawing/2017/model3d" xmlns:o="urn:schemas-microsoft-com:office:office" xmlns:oel="http://schemas.microsoft.com/office/2019/extlst" xmlns:r="http://schemas.openxmlformats.org/officeDocument/2006/relationships" xmlns:m="http://schemas.openxmlformats.org/officeDocument/2006/math" xmlns:v="urn:schemas-microsoft-com:vml" xmlns:wp14="http://schemas.microsoft.com/office/word/2010/wordprocessingDrawing" xmlns:wp="http://schemas.openxmlformats.org/drawingml/2006/wordprocessingDrawing" xmlns:w10="urn:schemas-microsoft-com:office:word" xmlns:w="http://schemas.openxmlformats.org/wordprocessingml/2006/main" xmlns:w14="http://schemas.microsoft.com/office/word/2010/wordml" xmlns:w15="http://schemas.microsoft.com/office/word/2012/wordml" xmlns:w16cex="http://schemas.microsoft.com/office/word/2018/wordml/cex" xmlns:w16cid="http://schemas.microsoft.com/office/word/2016/wordml/cid" xmlns:w16="http://schemas.microsoft.com/office/word/2018/wordml" xmlns:w16du="http://schemas.microsoft.com/office/word/2023/wordml/word16du" xmlns:w16sdtdh="http://schemas.microsoft.com/office/word/2020/wordml/sdtdatahash" xmlns:w16sdtfl="http://schemas.microsoft.com/office/word/2024/wordml/sdtformatlock" xmlns:w16se="http://schemas.microsoft.com/office/word/2015/wordml/symex" xmlns:wpg="http://schemas.microsoft.com/office/word/2010/wordprocessingGroup" xmlns:wpi="http://schemas.microsoft.com/office/word/2010/wordprocessingInk" xmlns:wne="http://schemas.microsoft.com/office/word/2006/wordml" xmlns:wps="http://schemas.microsoft.com/office/word/2010/wordprocessingShape" mc:Ignorable="w14 w15 w16se w16cid w16 w16cex w16sdtdh w16sdtfl w16du wp14"/>
 </file>
 
 <file path=word/styles.xml><?xml version="1.0" encoding="utf-8"?>

</xml_diff>

<commit_message>
Fixing lost data on buffer overflow in progress
</commit_message>
<xml_diff>
--- a/CVUT kit com spec.docx
+++ b/CVUT kit com spec.docx
@@ -2117,19 +2117,11 @@
                 <w:szCs w:val="18"/>
               </w:rPr>
             </w:pPr>
-            <w:proofErr w:type="gramStart"/>
-            <w:r>
-              <w:rPr>
-                <w:szCs w:val="18"/>
-              </w:rPr>
-              <w:t>Char[</w:t>
-            </w:r>
-            <w:proofErr w:type="gramEnd"/>
-            <w:r>
-              <w:rPr>
-                <w:szCs w:val="18"/>
-              </w:rPr>
-              <w:t>8]</w:t>
+            <w:r>
+              <w:rPr>
+                <w:szCs w:val="18"/>
+              </w:rPr>
+              <w:t>Char[8]</w:t>
             </w:r>
           </w:p>
         </w:tc>
@@ -2215,19 +2207,11 @@
                 <w:szCs w:val="18"/>
               </w:rPr>
             </w:pPr>
-            <w:proofErr w:type="gramStart"/>
-            <w:r>
-              <w:rPr>
-                <w:szCs w:val="18"/>
-              </w:rPr>
-              <w:t>Char[</w:t>
-            </w:r>
-            <w:proofErr w:type="gramEnd"/>
-            <w:r>
-              <w:rPr>
-                <w:szCs w:val="18"/>
-              </w:rPr>
-              <w:t>30]</w:t>
+            <w:r>
+              <w:rPr>
+                <w:szCs w:val="18"/>
+              </w:rPr>
+              <w:t>Char[30]</w:t>
             </w:r>
           </w:p>
         </w:tc>
@@ -2415,19 +2399,11 @@
                 <w:szCs w:val="18"/>
               </w:rPr>
             </w:pPr>
-            <w:proofErr w:type="gramStart"/>
-            <w:r>
-              <w:rPr>
-                <w:szCs w:val="18"/>
-              </w:rPr>
-              <w:t>Char[</w:t>
-            </w:r>
-            <w:proofErr w:type="gramEnd"/>
-            <w:r>
-              <w:rPr>
-                <w:szCs w:val="18"/>
-              </w:rPr>
-              <w:t>4]</w:t>
+            <w:r>
+              <w:rPr>
+                <w:szCs w:val="18"/>
+              </w:rPr>
+              <w:t>Char[4]</w:t>
             </w:r>
           </w:p>
         </w:tc>
@@ -2553,16 +2529,8 @@
               <w:rPr>
                 <w:szCs w:val="18"/>
               </w:rPr>
-              <w:t xml:space="preserve">(4 bytes) y = </w:t>
-            </w:r>
-            <w:proofErr w:type="spellStart"/>
-            <w:r>
-              <w:rPr>
-                <w:szCs w:val="18"/>
-              </w:rPr>
-              <w:t>k×x+q</w:t>
-            </w:r>
-            <w:proofErr w:type="spellEnd"/>
+              <w:t>(4 bytes) y = k×x+q</w:t>
+            </w:r>
           </w:p>
         </w:tc>
       </w:tr>
@@ -2707,19 +2675,11 @@
                 <w:szCs w:val="18"/>
               </w:rPr>
             </w:pPr>
-            <w:proofErr w:type="gramStart"/>
-            <w:r>
-              <w:rPr>
-                <w:szCs w:val="18"/>
-              </w:rPr>
-              <w:t>Char[</w:t>
-            </w:r>
-            <w:proofErr w:type="gramEnd"/>
-            <w:r>
-              <w:rPr>
-                <w:szCs w:val="18"/>
-              </w:rPr>
-              <w:t>4]</w:t>
+            <w:r>
+              <w:rPr>
+                <w:szCs w:val="18"/>
+              </w:rPr>
+              <w:t>Char[4]</w:t>
             </w:r>
           </w:p>
         </w:tc>
@@ -3498,14 +3458,12 @@
                 <w:szCs w:val="18"/>
               </w:rPr>
             </w:pPr>
-            <w:proofErr w:type="gramStart"/>
             <w:r>
               <w:rPr>
                 <w:szCs w:val="18"/>
               </w:rPr>
               <w:t>Data[</w:t>
             </w:r>
-            <w:proofErr w:type="gramEnd"/>
             <w:r>
               <w:rPr>
                 <w:szCs w:val="18"/>
@@ -3688,19 +3646,11 @@
                 <w:szCs w:val="18"/>
               </w:rPr>
             </w:pPr>
-            <w:proofErr w:type="gramStart"/>
-            <w:r>
-              <w:rPr>
-                <w:szCs w:val="18"/>
-              </w:rPr>
-              <w:t>Data[</w:t>
-            </w:r>
-            <w:proofErr w:type="gramEnd"/>
-            <w:r>
-              <w:rPr>
-                <w:szCs w:val="18"/>
-              </w:rPr>
-              <w:t>Ch</w:t>
+            <w:r>
+              <w:rPr>
+                <w:szCs w:val="18"/>
+              </w:rPr>
+              <w:t>Data[Ch</w:t>
             </w:r>
             <w:r>
               <w:rPr>
@@ -3811,19 +3761,11 @@
                 <w:szCs w:val="18"/>
               </w:rPr>
             </w:pPr>
-            <w:proofErr w:type="gramStart"/>
-            <w:r>
-              <w:rPr>
-                <w:szCs w:val="18"/>
-              </w:rPr>
-              <w:t>Data[</w:t>
-            </w:r>
-            <w:proofErr w:type="gramEnd"/>
-            <w:r>
-              <w:rPr>
-                <w:szCs w:val="18"/>
-              </w:rPr>
-              <w:t>Ch 1][0]</w:t>
+            <w:r>
+              <w:rPr>
+                <w:szCs w:val="18"/>
+              </w:rPr>
+              <w:t>Data[Ch 1][0]</w:t>
             </w:r>
           </w:p>
         </w:tc>
@@ -4001,19 +3943,11 @@
                 <w:szCs w:val="18"/>
               </w:rPr>
             </w:pPr>
-            <w:proofErr w:type="gramStart"/>
-            <w:r>
-              <w:rPr>
-                <w:szCs w:val="18"/>
-              </w:rPr>
-              <w:t>Data[</w:t>
-            </w:r>
-            <w:proofErr w:type="gramEnd"/>
-            <w:r>
-              <w:rPr>
-                <w:szCs w:val="18"/>
-              </w:rPr>
-              <w:t xml:space="preserve">Ch </w:t>
+            <w:r>
+              <w:rPr>
+                <w:szCs w:val="18"/>
+              </w:rPr>
+              <w:t xml:space="preserve">Data[Ch </w:t>
             </w:r>
             <w:r>
               <w:rPr>
@@ -4104,21 +4038,7 @@
               <w:rPr>
                 <w:szCs w:val="18"/>
               </w:rPr>
-              <w:t xml:space="preserve">Parity </w:t>
-            </w:r>
-            <w:proofErr w:type="gramStart"/>
-            <w:r>
-              <w:rPr>
-                <w:szCs w:val="18"/>
-              </w:rPr>
-              <w:t>errors[</w:t>
-            </w:r>
-            <w:proofErr w:type="gramEnd"/>
-            <w:r>
-              <w:rPr>
-                <w:szCs w:val="18"/>
-              </w:rPr>
-              <w:t>Ch 0]</w:t>
+              <w:t>Parity errors[Ch 0]</w:t>
             </w:r>
           </w:p>
         </w:tc>
@@ -4276,21 +4196,7 @@
               <w:rPr>
                 <w:szCs w:val="18"/>
               </w:rPr>
-              <w:t xml:space="preserve">Parity </w:t>
-            </w:r>
-            <w:proofErr w:type="gramStart"/>
-            <w:r>
-              <w:rPr>
-                <w:szCs w:val="18"/>
-              </w:rPr>
-              <w:t>errors[</w:t>
-            </w:r>
-            <w:proofErr w:type="gramEnd"/>
-            <w:r>
-              <w:rPr>
-                <w:szCs w:val="18"/>
-              </w:rPr>
-              <w:t>Ch n]</w:t>
+              <w:t>Parity errors[Ch n]</w:t>
             </w:r>
           </w:p>
         </w:tc>
@@ -4936,19 +4842,11 @@
                 <w:szCs w:val="18"/>
               </w:rPr>
             </w:pPr>
-            <w:proofErr w:type="gramStart"/>
-            <w:r>
-              <w:rPr>
-                <w:szCs w:val="18"/>
-              </w:rPr>
-              <w:t>Char[</w:t>
-            </w:r>
-            <w:proofErr w:type="gramEnd"/>
-            <w:r>
-              <w:rPr>
-                <w:szCs w:val="18"/>
-              </w:rPr>
-              <w:t>]</w:t>
+            <w:r>
+              <w:rPr>
+                <w:szCs w:val="18"/>
+              </w:rPr>
+              <w:t>Char[]</w:t>
             </w:r>
           </w:p>
         </w:tc>
@@ -6443,7 +6341,6 @@
               </w:rPr>
               <w:t xml:space="preserve"> + </w:t>
             </w:r>
-            <w:proofErr w:type="gramStart"/>
             <w:r>
               <w:rPr>
                 <w:szCs w:val="18"/>
@@ -6466,14 +6363,7 @@
               <w:rPr>
                 <w:szCs w:val="18"/>
               </w:rPr>
-              <w:t>Port</w:t>
-            </w:r>
-            <w:proofErr w:type="gramEnd"/>
-            <w:r>
-              <w:rPr>
-                <w:szCs w:val="18"/>
-              </w:rPr>
-              <w:t xml:space="preserve">, </w:t>
+              <w:t xml:space="preserve">Port, </w:t>
             </w:r>
             <w:r>
               <w:rPr>
@@ -6897,19 +6787,11 @@
               </w:rPr>
               <w:t>n</w:t>
             </w:r>
-            <w:proofErr w:type="gramStart"/>
-            <w:r>
-              <w:rPr>
-                <w:szCs w:val="18"/>
-              </w:rPr>
-              <w:t>×(</w:t>
-            </w:r>
-            <w:proofErr w:type="gramEnd"/>
-            <w:r>
-              <w:rPr>
-                <w:szCs w:val="18"/>
-              </w:rPr>
-              <w:t>IP, Port)</w:t>
+            <w:r>
+              <w:rPr>
+                <w:szCs w:val="18"/>
+              </w:rPr>
+              <w:t>×(IP, Port)</w:t>
             </w:r>
           </w:p>
         </w:tc>
@@ -8031,7 +7913,6 @@
                 <w:szCs w:val="18"/>
               </w:rPr>
             </w:pPr>
-            <w:proofErr w:type="spellStart"/>
             <w:r>
               <w:rPr>
                 <w:szCs w:val="18"/>
@@ -8044,7 +7925,6 @@
               </w:rPr>
               <w:t>fg</w:t>
             </w:r>
-            <w:proofErr w:type="spellEnd"/>
             <w:r>
               <w:rPr>
                 <w:szCs w:val="18"/>
@@ -8793,30 +8673,8 @@
               <w:rPr>
                 <w:szCs w:val="18"/>
               </w:rPr>
-              <w:t xml:space="preserve">Active </w:t>
-            </w:r>
-            <w:proofErr w:type="spellStart"/>
-            <w:r>
-              <w:rPr>
-                <w:szCs w:val="18"/>
-              </w:rPr>
-              <w:t>cfg</w:t>
-            </w:r>
-            <w:proofErr w:type="spellEnd"/>
-            <w:r>
-              <w:rPr>
-                <w:szCs w:val="18"/>
-              </w:rPr>
-              <w:t xml:space="preserve"> + stored </w:t>
-            </w:r>
-            <w:proofErr w:type="spellStart"/>
-            <w:r>
-              <w:rPr>
-                <w:szCs w:val="18"/>
-              </w:rPr>
-              <w:t>cfg</w:t>
-            </w:r>
-            <w:proofErr w:type="spellEnd"/>
+              <w:t>Active cfg + stored cfg</w:t>
+            </w:r>
           </w:p>
         </w:tc>
         <w:tc>
@@ -8869,6 +8727,249 @@
             </w:r>
             <w:r>
               <w:t>command</w:t>
+            </w:r>
+            <w:r>
+              <w:rPr>
+                <w:szCs w:val="18"/>
+              </w:rPr>
+              <w:fldChar w:fldCharType="end"/>
+            </w:r>
+          </w:p>
+        </w:tc>
+      </w:tr>
+      <w:tr>
+        <w:trPr>
+          <w:tblHeader/>
+        </w:trPr>
+        <w:tc>
+          <w:tcPr>
+            <w:tcW w:w="906" w:type="pct"/>
+          </w:tcPr>
+          <w:p>
+            <w:pPr>
+              <w:rPr>
+                <w:szCs w:val="18"/>
+              </w:rPr>
+            </w:pPr>
+            <w:r>
+              <w:rPr>
+                <w:szCs w:val="18"/>
+              </w:rPr>
+              <w:t>Set calibration</w:t>
+            </w:r>
+          </w:p>
+        </w:tc>
+        <w:tc>
+          <w:tcPr>
+            <w:tcW w:w="318" w:type="pct"/>
+          </w:tcPr>
+          <w:p>
+            <w:pPr>
+              <w:jc w:val="right"/>
+              <w:rPr>
+                <w:szCs w:val="18"/>
+              </w:rPr>
+            </w:pPr>
+            <w:r>
+              <w:rPr>
+                <w:szCs w:val="18"/>
+              </w:rPr>
+              <w:t>16</w:t>
+            </w:r>
+          </w:p>
+        </w:tc>
+        <w:tc>
+          <w:tcPr>
+            <w:tcW w:w="641" w:type="pct"/>
+          </w:tcPr>
+          <w:p>
+            <w:pPr>
+              <w:rPr>
+                <w:szCs w:val="18"/>
+              </w:rPr>
+            </w:pPr>
+            <w:r>
+              <w:rPr>
+                <w:szCs w:val="18"/>
+              </w:rPr>
+              <w:t>S</w:t>
+            </w:r>
+            <w:r>
+              <w:rPr>
+                <w:szCs w:val="18"/>
+              </w:rPr>
+              <w:t xml:space="preserve">ave, </w:t>
+            </w:r>
+            <w:r>
+              <w:rPr>
+                <w:szCs w:val="18"/>
+              </w:rPr>
+              <w:t>Channels,</w:t>
+            </w:r>
+            <w:r>
+              <w:rPr>
+                <w:szCs w:val="18"/>
+              </w:rPr>
+              <w:t xml:space="preserve"> n×(</w:t>
+            </w:r>
+            <w:r>
+              <w:rPr>
+                <w:szCs w:val="18"/>
+              </w:rPr>
+              <w:t>unit, offset, gain)</w:t>
+            </w:r>
+            <w:r>
+              <w:rPr>
+                <w:szCs w:val="18"/>
+              </w:rPr>
+              <w:t xml:space="preserve">, </w:t>
+            </w:r>
+            <w:r>
+              <w:rPr>
+                <w:szCs w:val="18"/>
+              </w:rPr>
+              <w:t>crc</w:t>
+            </w:r>
+          </w:p>
+        </w:tc>
+        <w:tc>
+          <w:tcPr>
+            <w:tcW w:w="810" w:type="pct"/>
+          </w:tcPr>
+          <w:p>
+            <w:pPr>
+              <w:rPr>
+                <w:szCs w:val="18"/>
+              </w:rPr>
+            </w:pPr>
+            <w:r>
+              <w:rPr>
+                <w:szCs w:val="18"/>
+              </w:rPr>
+              <w:t>ACK</w:t>
+            </w:r>
+            <w:r>
+              <w:rPr>
+                <w:szCs w:val="18"/>
+              </w:rPr>
+              <w:t xml:space="preserve"> + </w:t>
+            </w:r>
+            <w:r>
+              <w:rPr>
+                <w:szCs w:val="18"/>
+              </w:rPr>
+              <w:t>save ack</w:t>
+            </w:r>
+          </w:p>
+        </w:tc>
+        <w:tc>
+          <w:tcPr>
+            <w:tcW w:w="2325" w:type="pct"/>
+          </w:tcPr>
+          <w:p>
+            <w:pPr>
+              <w:rPr>
+                <w:szCs w:val="18"/>
+              </w:rPr>
+            </w:pPr>
+            <w:r>
+              <w:rPr>
+                <w:szCs w:val="18"/>
+              </w:rPr>
+              <w:t>Set calibration constants</w:t>
+            </w:r>
+          </w:p>
+          <w:p>
+            <w:pPr>
+              <w:rPr>
+                <w:szCs w:val="18"/>
+              </w:rPr>
+            </w:pPr>
+            <w:r>
+              <w:rPr>
+                <w:szCs w:val="18"/>
+              </w:rPr>
+              <w:fldChar w:fldCharType="begin"/>
+            </w:r>
+            <w:r>
+              <w:rPr>
+                <w:szCs w:val="18"/>
+              </w:rPr>
+              <w:instrText xml:space="preserve"> REF _Ref224285701 \h </w:instrText>
+            </w:r>
+            <w:r>
+              <w:rPr>
+                <w:szCs w:val="18"/>
+              </w:rPr>
+            </w:r>
+            <w:r>
+              <w:rPr>
+                <w:szCs w:val="18"/>
+              </w:rPr>
+              <w:fldChar w:fldCharType="separate"/>
+            </w:r>
+            <w:r>
+              <w:t xml:space="preserve">Table </w:t>
+            </w:r>
+            <w:r>
+              <w:rPr>
+                <w:noProof/>
+              </w:rPr>
+              <w:t>22</w:t>
+            </w:r>
+            <w:r>
+              <w:t xml:space="preserve"> Set calibration command</w:t>
+            </w:r>
+            <w:r>
+              <w:rPr>
+                <w:szCs w:val="18"/>
+              </w:rPr>
+              <w:fldChar w:fldCharType="end"/>
+            </w:r>
+          </w:p>
+          <w:p>
+            <w:pPr>
+              <w:rPr>
+                <w:szCs w:val="18"/>
+              </w:rPr>
+            </w:pPr>
+            <w:r>
+              <w:rPr>
+                <w:szCs w:val="18"/>
+              </w:rPr>
+              <w:fldChar w:fldCharType="begin"/>
+            </w:r>
+            <w:r>
+              <w:rPr>
+                <w:szCs w:val="18"/>
+              </w:rPr>
+              <w:instrText xml:space="preserve"> REF _Ref224286613 \h </w:instrText>
+            </w:r>
+            <w:r>
+              <w:rPr>
+                <w:szCs w:val="18"/>
+              </w:rPr>
+            </w:r>
+            <w:r>
+              <w:rPr>
+                <w:szCs w:val="18"/>
+              </w:rPr>
+              <w:fldChar w:fldCharType="separate"/>
+            </w:r>
+            <w:r>
+              <w:t xml:space="preserve">Table </w:t>
+            </w:r>
+            <w:r>
+              <w:rPr>
+                <w:noProof/>
+              </w:rPr>
+              <w:t>23</w:t>
+            </w:r>
+            <w:r>
+              <w:t xml:space="preserve"> Response to </w:t>
+            </w:r>
+            <w:r>
+              <w:t>Set calibration command</w:t>
             </w:r>
             <w:r>
               <w:rPr>
@@ -8886,25 +8987,6 @@
         <w:keepNext/>
       </w:pPr>
       <w:bookmarkStart w:id="5" w:name="_Ref198133105"/>
-    </w:p>
-    <w:p>
-      <w:pPr>
-        <w:rPr>
-          <w:i/>
-          <w:iCs/>
-          <w:color w:val="0E2841" w:themeColor="text2"/>
-          <w:szCs w:val="18"/>
-        </w:rPr>
-      </w:pPr>
-      <w:r>
-        <w:br w:type="page"/>
-      </w:r>
-    </w:p>
-    <w:p>
-      <w:pPr>
-        <w:pStyle w:val="Titulek"/>
-        <w:keepNext/>
-      </w:pPr>
       <w:r>
         <w:lastRenderedPageBreak/>
         <w:t xml:space="preserve">Table </w:t>
@@ -11318,15 +11400,7 @@
         <w:t>to</w:t>
       </w:r>
       <w:r>
-        <w:t xml:space="preserve"> Get </w:t>
-      </w:r>
-      <w:proofErr w:type="gramStart"/>
-      <w:r>
-        <w:t>receivers</w:t>
-      </w:r>
-      <w:proofErr w:type="gramEnd"/>
-      <w:r>
-        <w:t xml:space="preserve"> command</w:t>
+        <w:t xml:space="preserve"> Get receivers command</w:t>
       </w:r>
       <w:bookmarkEnd w:id="9"/>
       <w:bookmarkEnd w:id="10"/>
@@ -11761,7 +11835,6 @@
               </w:rPr>
               <w:t>[</w:t>
             </w:r>
-            <w:proofErr w:type="gramStart"/>
             <w:r>
               <w:rPr>
                 <w:szCs w:val="18"/>
@@ -11772,14 +11845,7 @@
               <w:rPr>
                 <w:szCs w:val="18"/>
               </w:rPr>
-              <w:t>[</w:t>
-            </w:r>
-            <w:proofErr w:type="gramEnd"/>
-            <w:r>
-              <w:rPr>
-                <w:szCs w:val="18"/>
-              </w:rPr>
-              <w:t>0]]</w:t>
+              <w:t>[0]]</w:t>
             </w:r>
           </w:p>
         </w:tc>
@@ -11868,7 +11934,6 @@
               </w:rPr>
               <w:t>[</w:t>
             </w:r>
-            <w:proofErr w:type="gramStart"/>
             <w:r>
               <w:rPr>
                 <w:szCs w:val="18"/>
@@ -11879,14 +11944,7 @@
               <w:rPr>
                 <w:szCs w:val="18"/>
               </w:rPr>
-              <w:t>[</w:t>
-            </w:r>
-            <w:proofErr w:type="gramEnd"/>
-            <w:r>
-              <w:rPr>
-                <w:szCs w:val="18"/>
-              </w:rPr>
-              <w:t>0]]</w:t>
+              <w:t>[0]]</w:t>
             </w:r>
           </w:p>
         </w:tc>
@@ -13873,14 +13931,12 @@
                 <w:szCs w:val="18"/>
               </w:rPr>
             </w:pPr>
-            <w:proofErr w:type="spellStart"/>
             <w:r>
               <w:rPr>
                 <w:szCs w:val="18"/>
               </w:rPr>
               <w:t>cfg</w:t>
             </w:r>
-            <w:proofErr w:type="spellEnd"/>
           </w:p>
         </w:tc>
         <w:tc>
@@ -14748,16 +14804,8 @@
               <w:rPr>
                 <w:szCs w:val="18"/>
               </w:rPr>
-              <w:t xml:space="preserve">Old </w:t>
-            </w:r>
-            <w:proofErr w:type="spellStart"/>
-            <w:r>
-              <w:rPr>
-                <w:szCs w:val="18"/>
-              </w:rPr>
-              <w:t>cfg</w:t>
-            </w:r>
-            <w:proofErr w:type="spellEnd"/>
+              <w:t>Old cfg</w:t>
+            </w:r>
           </w:p>
         </w:tc>
         <w:tc>
@@ -14804,21 +14852,7 @@
               <w:rPr>
                 <w:szCs w:val="18"/>
               </w:rPr>
-              <w:t xml:space="preserve">See </w:t>
-            </w:r>
-            <w:proofErr w:type="spellStart"/>
-            <w:r>
-              <w:rPr>
-                <w:szCs w:val="18"/>
-              </w:rPr>
-              <w:t>Cfg</w:t>
-            </w:r>
-            <w:proofErr w:type="spellEnd"/>
-            <w:r>
-              <w:rPr>
-                <w:szCs w:val="18"/>
-              </w:rPr>
-              <w:t xml:space="preserve"> in </w:t>
+              <w:t xml:space="preserve">See Cfg in </w:t>
             </w:r>
             <w:r>
               <w:rPr>
@@ -14905,16 +14939,8 @@
               <w:rPr>
                 <w:szCs w:val="18"/>
               </w:rPr>
-              <w:t xml:space="preserve">New </w:t>
-            </w:r>
-            <w:proofErr w:type="spellStart"/>
-            <w:r>
-              <w:rPr>
-                <w:szCs w:val="18"/>
-              </w:rPr>
-              <w:t>cfg</w:t>
-            </w:r>
-            <w:proofErr w:type="spellEnd"/>
+              <w:t>New cfg</w:t>
+            </w:r>
           </w:p>
         </w:tc>
         <w:tc>
@@ -14961,21 +14987,7 @@
               <w:rPr>
                 <w:szCs w:val="18"/>
               </w:rPr>
-              <w:t xml:space="preserve">See </w:t>
-            </w:r>
-            <w:proofErr w:type="spellStart"/>
-            <w:r>
-              <w:rPr>
-                <w:szCs w:val="18"/>
-              </w:rPr>
-              <w:t>Cfg</w:t>
-            </w:r>
-            <w:proofErr w:type="spellEnd"/>
-            <w:r>
-              <w:rPr>
-                <w:szCs w:val="18"/>
-              </w:rPr>
-              <w:t xml:space="preserve"> in </w:t>
+              <w:t xml:space="preserve">See Cfg in </w:t>
             </w:r>
             <w:r>
               <w:rPr>
@@ -17408,16 +17420,8 @@
               <w:rPr>
                 <w:szCs w:val="18"/>
               </w:rPr>
-              <w:t xml:space="preserve"> </w:t>
-            </w:r>
-            <w:proofErr w:type="spellStart"/>
-            <w:r>
-              <w:rPr>
-                <w:szCs w:val="18"/>
-              </w:rPr>
-              <w:t>cfg</w:t>
-            </w:r>
-            <w:proofErr w:type="spellEnd"/>
+              <w:t xml:space="preserve"> cfg</w:t>
+            </w:r>
           </w:p>
         </w:tc>
         <w:tc>
@@ -17464,21 +17468,7 @@
               <w:rPr>
                 <w:szCs w:val="18"/>
               </w:rPr>
-              <w:t xml:space="preserve">See </w:t>
-            </w:r>
-            <w:proofErr w:type="spellStart"/>
-            <w:r>
-              <w:rPr>
-                <w:szCs w:val="18"/>
-              </w:rPr>
-              <w:t>Cfg</w:t>
-            </w:r>
-            <w:proofErr w:type="spellEnd"/>
-            <w:r>
-              <w:rPr>
-                <w:szCs w:val="18"/>
-              </w:rPr>
-              <w:t xml:space="preserve"> in </w:t>
+              <w:t xml:space="preserve">See Cfg in </w:t>
             </w:r>
             <w:r>
               <w:rPr>
@@ -17571,16 +17561,8 @@
               <w:rPr>
                 <w:szCs w:val="18"/>
               </w:rPr>
-              <w:t xml:space="preserve"> </w:t>
-            </w:r>
-            <w:proofErr w:type="spellStart"/>
-            <w:r>
-              <w:rPr>
-                <w:szCs w:val="18"/>
-              </w:rPr>
-              <w:t>cfg</w:t>
-            </w:r>
-            <w:proofErr w:type="spellEnd"/>
+              <w:t xml:space="preserve"> cfg</w:t>
+            </w:r>
           </w:p>
         </w:tc>
         <w:tc>
@@ -17627,21 +17609,7 @@
               <w:rPr>
                 <w:szCs w:val="18"/>
               </w:rPr>
-              <w:t xml:space="preserve">See </w:t>
-            </w:r>
-            <w:proofErr w:type="spellStart"/>
-            <w:r>
-              <w:rPr>
-                <w:szCs w:val="18"/>
-              </w:rPr>
-              <w:t>Cfg</w:t>
-            </w:r>
-            <w:proofErr w:type="spellEnd"/>
-            <w:r>
-              <w:rPr>
-                <w:szCs w:val="18"/>
-              </w:rPr>
-              <w:t xml:space="preserve"> in </w:t>
+              <w:t xml:space="preserve">See Cfg in </w:t>
             </w:r>
             <w:r>
               <w:rPr>
@@ -17690,6 +17658,1703 @@
                 <w:szCs w:val="18"/>
               </w:rPr>
               <w:fldChar w:fldCharType="end"/>
+            </w:r>
+          </w:p>
+        </w:tc>
+      </w:tr>
+    </w:tbl>
+    <w:p>
+      <w:pPr>
+        <w:pStyle w:val="Titulek"/>
+        <w:keepNext/>
+      </w:pPr>
+      <w:bookmarkStart w:id="21" w:name="_Ref224285701"/>
+      <w:r>
+        <w:t xml:space="preserve">Table </w:t>
+      </w:r>
+      <w:r>
+        <w:fldChar w:fldCharType="begin"/>
+      </w:r>
+      <w:r>
+        <w:instrText xml:space="preserve"> SEQ Table \* ARABIC </w:instrText>
+      </w:r>
+      <w:r>
+        <w:fldChar w:fldCharType="separate"/>
+      </w:r>
+      <w:r>
+        <w:rPr>
+          <w:noProof/>
+        </w:rPr>
+        <w:t>22</w:t>
+      </w:r>
+      <w:r>
+        <w:fldChar w:fldCharType="end"/>
+      </w:r>
+      <w:r>
+        <w:t xml:space="preserve"> Set calibration command</w:t>
+      </w:r>
+      <w:bookmarkEnd w:id="21"/>
+    </w:p>
+    <w:tbl>
+      <w:tblPr>
+        <w:tblStyle w:val="Mkatabulky"/>
+        <w:tblW w:w="5000" w:type="pct"/>
+        <w:tblLook w:val="04A0" w:firstRow="1" w:lastRow="0" w:firstColumn="1" w:lastColumn="0" w:noHBand="0" w:noVBand="1"/>
+      </w:tblPr>
+      <w:tblGrid>
+        <w:gridCol w:w="1373"/>
+        <w:gridCol w:w="1836"/>
+        <w:gridCol w:w="1071"/>
+        <w:gridCol w:w="2144"/>
+        <w:gridCol w:w="3312"/>
+      </w:tblGrid>
+      <w:tr>
+        <w:tc>
+          <w:tcPr>
+            <w:tcW w:w="705" w:type="pct"/>
+          </w:tcPr>
+          <w:p>
+            <w:pPr>
+              <w:rPr>
+                <w:szCs w:val="18"/>
+              </w:rPr>
+            </w:pPr>
+            <w:r>
+              <w:rPr>
+                <w:b/>
+                <w:bCs/>
+                <w:szCs w:val="18"/>
+              </w:rPr>
+              <w:t>Byte offset</w:t>
+            </w:r>
+          </w:p>
+        </w:tc>
+        <w:tc>
+          <w:tcPr>
+            <w:tcW w:w="943" w:type="pct"/>
+          </w:tcPr>
+          <w:p>
+            <w:pPr>
+              <w:rPr>
+                <w:szCs w:val="18"/>
+              </w:rPr>
+            </w:pPr>
+            <w:r>
+              <w:rPr>
+                <w:b/>
+                <w:bCs/>
+                <w:szCs w:val="18"/>
+              </w:rPr>
+              <w:t>Field</w:t>
+            </w:r>
+          </w:p>
+        </w:tc>
+        <w:tc>
+          <w:tcPr>
+            <w:tcW w:w="550" w:type="pct"/>
+          </w:tcPr>
+          <w:p>
+            <w:pPr>
+              <w:rPr>
+                <w:szCs w:val="18"/>
+              </w:rPr>
+            </w:pPr>
+            <w:r>
+              <w:rPr>
+                <w:b/>
+                <w:bCs/>
+                <w:szCs w:val="18"/>
+              </w:rPr>
+              <w:t>Type</w:t>
+            </w:r>
+          </w:p>
+        </w:tc>
+        <w:tc>
+          <w:tcPr>
+            <w:tcW w:w="1101" w:type="pct"/>
+          </w:tcPr>
+          <w:p>
+            <w:pPr>
+              <w:rPr>
+                <w:szCs w:val="18"/>
+              </w:rPr>
+            </w:pPr>
+            <w:r>
+              <w:rPr>
+                <w:b/>
+                <w:bCs/>
+                <w:szCs w:val="18"/>
+              </w:rPr>
+              <w:t>Example</w:t>
+            </w:r>
+          </w:p>
+        </w:tc>
+        <w:tc>
+          <w:tcPr>
+            <w:tcW w:w="1701" w:type="pct"/>
+          </w:tcPr>
+          <w:p>
+            <w:pPr>
+              <w:rPr>
+                <w:szCs w:val="18"/>
+              </w:rPr>
+            </w:pPr>
+            <w:r>
+              <w:rPr>
+                <w:b/>
+                <w:bCs/>
+                <w:szCs w:val="18"/>
+              </w:rPr>
+              <w:t>Note</w:t>
+            </w:r>
+          </w:p>
+        </w:tc>
+      </w:tr>
+      <w:tr>
+        <w:tc>
+          <w:tcPr>
+            <w:tcW w:w="705" w:type="pct"/>
+          </w:tcPr>
+          <w:p>
+            <w:pPr>
+              <w:jc w:val="right"/>
+              <w:rPr>
+                <w:szCs w:val="18"/>
+              </w:rPr>
+            </w:pPr>
+            <w:r>
+              <w:rPr>
+                <w:szCs w:val="18"/>
+              </w:rPr>
+              <w:t>0</w:t>
+            </w:r>
+          </w:p>
+        </w:tc>
+        <w:tc>
+          <w:tcPr>
+            <w:tcW w:w="943" w:type="pct"/>
+          </w:tcPr>
+          <w:p>
+            <w:pPr>
+              <w:rPr>
+                <w:szCs w:val="18"/>
+              </w:rPr>
+            </w:pPr>
+            <w:r>
+              <w:rPr>
+                <w:szCs w:val="18"/>
+              </w:rPr>
+              <w:t>CMD</w:t>
+            </w:r>
+          </w:p>
+        </w:tc>
+        <w:tc>
+          <w:tcPr>
+            <w:tcW w:w="550" w:type="pct"/>
+          </w:tcPr>
+          <w:p>
+            <w:pPr>
+              <w:rPr>
+                <w:szCs w:val="18"/>
+              </w:rPr>
+            </w:pPr>
+            <w:r>
+              <w:rPr>
+                <w:szCs w:val="18"/>
+              </w:rPr>
+              <w:t>Uint32</w:t>
+            </w:r>
+          </w:p>
+        </w:tc>
+        <w:tc>
+          <w:tcPr>
+            <w:tcW w:w="1101" w:type="pct"/>
+          </w:tcPr>
+          <w:p>
+            <w:pPr>
+              <w:rPr>
+                <w:szCs w:val="18"/>
+              </w:rPr>
+            </w:pPr>
+            <w:r>
+              <w:rPr>
+                <w:szCs w:val="18"/>
+              </w:rPr>
+              <w:t>1</w:t>
+            </w:r>
+            <w:r>
+              <w:rPr>
+                <w:szCs w:val="18"/>
+              </w:rPr>
+              <w:t>6</w:t>
+            </w:r>
+          </w:p>
+        </w:tc>
+        <w:tc>
+          <w:tcPr>
+            <w:tcW w:w="1701" w:type="pct"/>
+          </w:tcPr>
+          <w:p>
+            <w:pPr>
+              <w:rPr>
+                <w:szCs w:val="18"/>
+              </w:rPr>
+            </w:pPr>
+          </w:p>
+        </w:tc>
+      </w:tr>
+      <w:tr>
+        <w:tc>
+          <w:tcPr>
+            <w:tcW w:w="705" w:type="pct"/>
+          </w:tcPr>
+          <w:p>
+            <w:pPr>
+              <w:jc w:val="right"/>
+              <w:rPr>
+                <w:szCs w:val="18"/>
+              </w:rPr>
+            </w:pPr>
+            <w:r>
+              <w:rPr>
+                <w:szCs w:val="18"/>
+              </w:rPr>
+              <w:t>4</w:t>
+            </w:r>
+          </w:p>
+        </w:tc>
+        <w:tc>
+          <w:tcPr>
+            <w:tcW w:w="943" w:type="pct"/>
+          </w:tcPr>
+          <w:p>
+            <w:pPr>
+              <w:rPr>
+                <w:szCs w:val="18"/>
+              </w:rPr>
+            </w:pPr>
+            <w:r>
+              <w:rPr>
+                <w:szCs w:val="18"/>
+              </w:rPr>
+              <w:t>save</w:t>
+            </w:r>
+          </w:p>
+        </w:tc>
+        <w:tc>
+          <w:tcPr>
+            <w:tcW w:w="550" w:type="pct"/>
+          </w:tcPr>
+          <w:p>
+            <w:pPr>
+              <w:rPr>
+                <w:szCs w:val="18"/>
+              </w:rPr>
+            </w:pPr>
+            <w:r>
+              <w:rPr>
+                <w:szCs w:val="18"/>
+              </w:rPr>
+              <w:t>Uint</w:t>
+            </w:r>
+            <w:r>
+              <w:rPr>
+                <w:szCs w:val="18"/>
+              </w:rPr>
+              <w:t>16</w:t>
+            </w:r>
+          </w:p>
+        </w:tc>
+        <w:tc>
+          <w:tcPr>
+            <w:tcW w:w="1101" w:type="pct"/>
+          </w:tcPr>
+          <w:p>
+            <w:pPr>
+              <w:rPr>
+                <w:szCs w:val="18"/>
+              </w:rPr>
+            </w:pPr>
+            <w:r>
+              <w:rPr>
+                <w:szCs w:val="18"/>
+              </w:rPr>
+              <w:t>0x</w:t>
+            </w:r>
+            <w:r>
+              <w:rPr>
+                <w:szCs w:val="18"/>
+              </w:rPr>
+              <w:t>00</w:t>
+            </w:r>
+            <w:r>
+              <w:rPr>
+                <w:szCs w:val="18"/>
+              </w:rPr>
+              <w:t>AC</w:t>
+            </w:r>
+          </w:p>
+        </w:tc>
+        <w:tc>
+          <w:tcPr>
+            <w:tcW w:w="1701" w:type="pct"/>
+          </w:tcPr>
+          <w:p>
+            <w:pPr>
+              <w:rPr>
+                <w:szCs w:val="18"/>
+              </w:rPr>
+            </w:pPr>
+            <w:r>
+              <w:rPr>
+                <w:szCs w:val="18"/>
+              </w:rPr>
+              <w:t>0xAC = store to EEPROM, otherwise not.</w:t>
+            </w:r>
+            <w:r>
+              <w:rPr>
+                <w:szCs w:val="18"/>
+              </w:rPr>
+              <w:t xml:space="preserve"> (Uint16 because of padding)</w:t>
+            </w:r>
+          </w:p>
+        </w:tc>
+      </w:tr>
+      <w:tr>
+        <w:tc>
+          <w:tcPr>
+            <w:tcW w:w="705" w:type="pct"/>
+          </w:tcPr>
+          <w:p>
+            <w:pPr>
+              <w:jc w:val="right"/>
+              <w:rPr>
+                <w:szCs w:val="18"/>
+              </w:rPr>
+            </w:pPr>
+            <w:r>
+              <w:rPr>
+                <w:szCs w:val="18"/>
+              </w:rPr>
+              <w:t>6</w:t>
+            </w:r>
+          </w:p>
+        </w:tc>
+        <w:tc>
+          <w:tcPr>
+            <w:tcW w:w="943" w:type="pct"/>
+          </w:tcPr>
+          <w:p>
+            <w:pPr>
+              <w:rPr>
+                <w:szCs w:val="18"/>
+              </w:rPr>
+            </w:pPr>
+            <w:r>
+              <w:rPr>
+                <w:szCs w:val="18"/>
+              </w:rPr>
+              <w:t>Channels count</w:t>
+            </w:r>
+          </w:p>
+        </w:tc>
+        <w:tc>
+          <w:tcPr>
+            <w:tcW w:w="550" w:type="pct"/>
+          </w:tcPr>
+          <w:p>
+            <w:pPr>
+              <w:rPr>
+                <w:szCs w:val="18"/>
+              </w:rPr>
+            </w:pPr>
+            <w:r>
+              <w:rPr>
+                <w:szCs w:val="18"/>
+              </w:rPr>
+              <w:t>Uint16</w:t>
+            </w:r>
+          </w:p>
+        </w:tc>
+        <w:tc>
+          <w:tcPr>
+            <w:tcW w:w="1101" w:type="pct"/>
+          </w:tcPr>
+          <w:p>
+            <w:pPr>
+              <w:rPr>
+                <w:szCs w:val="18"/>
+              </w:rPr>
+            </w:pPr>
+            <w:r>
+              <w:rPr>
+                <w:szCs w:val="18"/>
+              </w:rPr>
+              <w:t>n</w:t>
+            </w:r>
+          </w:p>
+        </w:tc>
+        <w:tc>
+          <w:tcPr>
+            <w:tcW w:w="1701" w:type="pct"/>
+          </w:tcPr>
+          <w:p>
+            <w:pPr>
+              <w:rPr>
+                <w:szCs w:val="18"/>
+              </w:rPr>
+            </w:pPr>
+            <w:r>
+              <w:rPr>
+                <w:szCs w:val="18"/>
+              </w:rPr>
+              <w:t>Uint8 is enough, but padding</w:t>
+            </w:r>
+          </w:p>
+        </w:tc>
+      </w:tr>
+      <w:tr>
+        <w:tc>
+          <w:tcPr>
+            <w:tcW w:w="705" w:type="pct"/>
+          </w:tcPr>
+          <w:p>
+            <w:pPr>
+              <w:jc w:val="right"/>
+              <w:rPr>
+                <w:szCs w:val="18"/>
+              </w:rPr>
+            </w:pPr>
+            <w:r>
+              <w:rPr>
+                <w:szCs w:val="18"/>
+              </w:rPr>
+              <w:t>8</w:t>
+            </w:r>
+          </w:p>
+        </w:tc>
+        <w:tc>
+          <w:tcPr>
+            <w:tcW w:w="943" w:type="pct"/>
+          </w:tcPr>
+          <w:p>
+            <w:pPr>
+              <w:rPr>
+                <w:szCs w:val="18"/>
+              </w:rPr>
+            </w:pPr>
+            <w:r>
+              <w:rPr>
+                <w:szCs w:val="18"/>
+              </w:rPr>
+              <w:t>Channel 0 unit</w:t>
+            </w:r>
+          </w:p>
+        </w:tc>
+        <w:tc>
+          <w:tcPr>
+            <w:tcW w:w="550" w:type="pct"/>
+          </w:tcPr>
+          <w:p>
+            <w:pPr>
+              <w:rPr>
+                <w:szCs w:val="18"/>
+              </w:rPr>
+            </w:pPr>
+            <w:r>
+              <w:rPr>
+                <w:szCs w:val="18"/>
+              </w:rPr>
+              <w:t>Char[4]</w:t>
+            </w:r>
+          </w:p>
+        </w:tc>
+        <w:tc>
+          <w:tcPr>
+            <w:tcW w:w="1101" w:type="pct"/>
+          </w:tcPr>
+          <w:p>
+            <w:pPr>
+              <w:rPr>
+                <w:szCs w:val="18"/>
+              </w:rPr>
+            </w:pPr>
+            <w:r>
+              <w:rPr>
+                <w:szCs w:val="18"/>
+              </w:rPr>
+              <w:t>„mV\0“</w:t>
+            </w:r>
+          </w:p>
+        </w:tc>
+        <w:tc>
+          <w:tcPr>
+            <w:tcW w:w="1701" w:type="pct"/>
+          </w:tcPr>
+          <w:p>
+            <w:pPr>
+              <w:rPr>
+                <w:szCs w:val="18"/>
+              </w:rPr>
+            </w:pPr>
+            <w:r>
+              <w:rPr>
+                <w:szCs w:val="18"/>
+              </w:rPr>
+              <w:t>Includes padding</w:t>
+            </w:r>
+          </w:p>
+        </w:tc>
+      </w:tr>
+      <w:tr>
+        <w:tc>
+          <w:tcPr>
+            <w:tcW w:w="705" w:type="pct"/>
+          </w:tcPr>
+          <w:p>
+            <w:pPr>
+              <w:jc w:val="right"/>
+              <w:rPr>
+                <w:szCs w:val="18"/>
+              </w:rPr>
+            </w:pPr>
+            <w:r>
+              <w:rPr>
+                <w:szCs w:val="18"/>
+              </w:rPr>
+              <w:t>12</w:t>
+            </w:r>
+          </w:p>
+        </w:tc>
+        <w:tc>
+          <w:tcPr>
+            <w:tcW w:w="943" w:type="pct"/>
+          </w:tcPr>
+          <w:p>
+            <w:pPr>
+              <w:rPr>
+                <w:szCs w:val="18"/>
+              </w:rPr>
+            </w:pPr>
+            <w:r>
+              <w:rPr>
+                <w:szCs w:val="18"/>
+              </w:rPr>
+              <w:t>Channel 0 offset (q)</w:t>
+            </w:r>
+          </w:p>
+        </w:tc>
+        <w:tc>
+          <w:tcPr>
+            <w:tcW w:w="550" w:type="pct"/>
+          </w:tcPr>
+          <w:p>
+            <w:pPr>
+              <w:rPr>
+                <w:szCs w:val="18"/>
+              </w:rPr>
+            </w:pPr>
+            <w:r>
+              <w:rPr>
+                <w:szCs w:val="18"/>
+              </w:rPr>
+              <w:t>float</w:t>
+            </w:r>
+          </w:p>
+        </w:tc>
+        <w:tc>
+          <w:tcPr>
+            <w:tcW w:w="1101" w:type="pct"/>
+          </w:tcPr>
+          <w:p>
+            <w:pPr>
+              <w:rPr>
+                <w:szCs w:val="18"/>
+              </w:rPr>
+            </w:pPr>
+          </w:p>
+        </w:tc>
+        <w:tc>
+          <w:tcPr>
+            <w:tcW w:w="1701" w:type="pct"/>
+          </w:tcPr>
+          <w:p>
+            <w:pPr>
+              <w:rPr>
+                <w:szCs w:val="18"/>
+              </w:rPr>
+            </w:pPr>
+            <w:r>
+              <w:rPr>
+                <w:szCs w:val="18"/>
+              </w:rPr>
+              <w:t>(4 bytes) y = k×x+q</w:t>
+            </w:r>
+          </w:p>
+        </w:tc>
+      </w:tr>
+      <w:tr>
+        <w:tc>
+          <w:tcPr>
+            <w:tcW w:w="705" w:type="pct"/>
+          </w:tcPr>
+          <w:p>
+            <w:pPr>
+              <w:jc w:val="right"/>
+              <w:rPr>
+                <w:szCs w:val="18"/>
+              </w:rPr>
+            </w:pPr>
+            <w:r>
+              <w:rPr>
+                <w:szCs w:val="18"/>
+              </w:rPr>
+              <w:t>16</w:t>
+            </w:r>
+          </w:p>
+        </w:tc>
+        <w:tc>
+          <w:tcPr>
+            <w:tcW w:w="943" w:type="pct"/>
+          </w:tcPr>
+          <w:p>
+            <w:pPr>
+              <w:rPr>
+                <w:szCs w:val="18"/>
+              </w:rPr>
+            </w:pPr>
+            <w:r>
+              <w:rPr>
+                <w:szCs w:val="18"/>
+              </w:rPr>
+              <w:t>Channel 0 gain (k)</w:t>
+            </w:r>
+          </w:p>
+        </w:tc>
+        <w:tc>
+          <w:tcPr>
+            <w:tcW w:w="550" w:type="pct"/>
+          </w:tcPr>
+          <w:p>
+            <w:pPr>
+              <w:rPr>
+                <w:szCs w:val="18"/>
+              </w:rPr>
+            </w:pPr>
+            <w:r>
+              <w:rPr>
+                <w:szCs w:val="18"/>
+              </w:rPr>
+              <w:t>float</w:t>
+            </w:r>
+          </w:p>
+        </w:tc>
+        <w:tc>
+          <w:tcPr>
+            <w:tcW w:w="1101" w:type="pct"/>
+          </w:tcPr>
+          <w:p>
+            <w:pPr>
+              <w:rPr>
+                <w:szCs w:val="18"/>
+              </w:rPr>
+            </w:pPr>
+          </w:p>
+        </w:tc>
+        <w:tc>
+          <w:tcPr>
+            <w:tcW w:w="1701" w:type="pct"/>
+          </w:tcPr>
+          <w:p>
+            <w:pPr>
+              <w:rPr>
+                <w:szCs w:val="18"/>
+              </w:rPr>
+            </w:pPr>
+            <w:r>
+              <w:rPr>
+                <w:szCs w:val="18"/>
+              </w:rPr>
+              <w:t>(4 bytes)</w:t>
+            </w:r>
+          </w:p>
+        </w:tc>
+      </w:tr>
+      <w:tr>
+        <w:tc>
+          <w:tcPr>
+            <w:tcW w:w="705" w:type="pct"/>
+          </w:tcPr>
+          <w:p>
+            <w:pPr>
+              <w:jc w:val="right"/>
+              <w:rPr>
+                <w:szCs w:val="18"/>
+              </w:rPr>
+            </w:pPr>
+            <w:r>
+              <w:rPr>
+                <w:szCs w:val="18"/>
+              </w:rPr>
+              <w:t>20</w:t>
+            </w:r>
+          </w:p>
+        </w:tc>
+        <w:tc>
+          <w:tcPr>
+            <w:tcW w:w="943" w:type="pct"/>
+          </w:tcPr>
+          <w:p>
+            <w:pPr>
+              <w:rPr>
+                <w:szCs w:val="18"/>
+              </w:rPr>
+            </w:pPr>
+            <w:r>
+              <w:rPr>
+                <w:szCs w:val="18"/>
+              </w:rPr>
+              <w:t>Channel 1 unit</w:t>
+            </w:r>
+          </w:p>
+        </w:tc>
+        <w:tc>
+          <w:tcPr>
+            <w:tcW w:w="550" w:type="pct"/>
+          </w:tcPr>
+          <w:p>
+            <w:pPr>
+              <w:rPr>
+                <w:szCs w:val="18"/>
+              </w:rPr>
+            </w:pPr>
+            <w:r>
+              <w:rPr>
+                <w:szCs w:val="18"/>
+              </w:rPr>
+              <w:t>Char[4]</w:t>
+            </w:r>
+          </w:p>
+        </w:tc>
+        <w:tc>
+          <w:tcPr>
+            <w:tcW w:w="1101" w:type="pct"/>
+          </w:tcPr>
+          <w:p>
+            <w:pPr>
+              <w:rPr>
+                <w:szCs w:val="18"/>
+              </w:rPr>
+            </w:pPr>
+            <w:r>
+              <w:rPr>
+                <w:szCs w:val="18"/>
+              </w:rPr>
+              <w:t>„A\0“</w:t>
+            </w:r>
+          </w:p>
+        </w:tc>
+        <w:tc>
+          <w:tcPr>
+            <w:tcW w:w="1701" w:type="pct"/>
+          </w:tcPr>
+          <w:p>
+            <w:pPr>
+              <w:rPr>
+                <w:szCs w:val="18"/>
+              </w:rPr>
+            </w:pPr>
+            <w:r>
+              <w:rPr>
+                <w:szCs w:val="18"/>
+              </w:rPr>
+              <w:t>Includes padding</w:t>
+            </w:r>
+          </w:p>
+        </w:tc>
+      </w:tr>
+      <w:tr>
+        <w:tc>
+          <w:tcPr>
+            <w:tcW w:w="705" w:type="pct"/>
+          </w:tcPr>
+          <w:p>
+            <w:pPr>
+              <w:jc w:val="right"/>
+              <w:rPr>
+                <w:szCs w:val="18"/>
+              </w:rPr>
+            </w:pPr>
+            <w:r>
+              <w:rPr>
+                <w:szCs w:val="18"/>
+              </w:rPr>
+              <w:t>24</w:t>
+            </w:r>
+          </w:p>
+        </w:tc>
+        <w:tc>
+          <w:tcPr>
+            <w:tcW w:w="943" w:type="pct"/>
+          </w:tcPr>
+          <w:p>
+            <w:pPr>
+              <w:rPr>
+                <w:szCs w:val="18"/>
+              </w:rPr>
+            </w:pPr>
+            <w:r>
+              <w:rPr>
+                <w:szCs w:val="18"/>
+              </w:rPr>
+              <w:t>Channel 1 offset (q)</w:t>
+            </w:r>
+          </w:p>
+        </w:tc>
+        <w:tc>
+          <w:tcPr>
+            <w:tcW w:w="550" w:type="pct"/>
+          </w:tcPr>
+          <w:p>
+            <w:pPr>
+              <w:rPr>
+                <w:szCs w:val="18"/>
+              </w:rPr>
+            </w:pPr>
+            <w:r>
+              <w:rPr>
+                <w:szCs w:val="18"/>
+              </w:rPr>
+              <w:t>float</w:t>
+            </w:r>
+          </w:p>
+        </w:tc>
+        <w:tc>
+          <w:tcPr>
+            <w:tcW w:w="1101" w:type="pct"/>
+          </w:tcPr>
+          <w:p>
+            <w:pPr>
+              <w:rPr>
+                <w:szCs w:val="18"/>
+              </w:rPr>
+            </w:pPr>
+          </w:p>
+        </w:tc>
+        <w:tc>
+          <w:tcPr>
+            <w:tcW w:w="1701" w:type="pct"/>
+          </w:tcPr>
+          <w:p>
+            <w:pPr>
+              <w:rPr>
+                <w:szCs w:val="18"/>
+              </w:rPr>
+            </w:pPr>
+            <w:r>
+              <w:rPr>
+                <w:szCs w:val="18"/>
+              </w:rPr>
+              <w:t>(4 bytes)</w:t>
+            </w:r>
+          </w:p>
+        </w:tc>
+      </w:tr>
+      <w:tr>
+        <w:tc>
+          <w:tcPr>
+            <w:tcW w:w="705" w:type="pct"/>
+          </w:tcPr>
+          <w:p>
+            <w:pPr>
+              <w:jc w:val="right"/>
+              <w:rPr>
+                <w:szCs w:val="18"/>
+              </w:rPr>
+            </w:pPr>
+            <w:r>
+              <w:rPr>
+                <w:szCs w:val="18"/>
+              </w:rPr>
+              <w:t>28</w:t>
+            </w:r>
+          </w:p>
+        </w:tc>
+        <w:tc>
+          <w:tcPr>
+            <w:tcW w:w="943" w:type="pct"/>
+          </w:tcPr>
+          <w:p>
+            <w:pPr>
+              <w:rPr>
+                <w:szCs w:val="18"/>
+              </w:rPr>
+            </w:pPr>
+            <w:r>
+              <w:rPr>
+                <w:szCs w:val="18"/>
+              </w:rPr>
+              <w:t>Channel 1 gain (k)</w:t>
+            </w:r>
+          </w:p>
+        </w:tc>
+        <w:tc>
+          <w:tcPr>
+            <w:tcW w:w="550" w:type="pct"/>
+          </w:tcPr>
+          <w:p>
+            <w:pPr>
+              <w:rPr>
+                <w:szCs w:val="18"/>
+              </w:rPr>
+            </w:pPr>
+            <w:r>
+              <w:rPr>
+                <w:szCs w:val="18"/>
+              </w:rPr>
+              <w:t>float</w:t>
+            </w:r>
+          </w:p>
+        </w:tc>
+        <w:tc>
+          <w:tcPr>
+            <w:tcW w:w="1101" w:type="pct"/>
+          </w:tcPr>
+          <w:p>
+            <w:pPr>
+              <w:rPr>
+                <w:szCs w:val="18"/>
+              </w:rPr>
+            </w:pPr>
+          </w:p>
+        </w:tc>
+        <w:tc>
+          <w:tcPr>
+            <w:tcW w:w="1701" w:type="pct"/>
+          </w:tcPr>
+          <w:p>
+            <w:pPr>
+              <w:rPr>
+                <w:szCs w:val="18"/>
+              </w:rPr>
+            </w:pPr>
+            <w:r>
+              <w:rPr>
+                <w:szCs w:val="18"/>
+              </w:rPr>
+              <w:t>(4 bytes)</w:t>
+            </w:r>
+          </w:p>
+        </w:tc>
+      </w:tr>
+      <w:tr>
+        <w:tc>
+          <w:tcPr>
+            <w:tcW w:w="705" w:type="pct"/>
+          </w:tcPr>
+          <w:p>
+            <w:pPr>
+              <w:jc w:val="right"/>
+              <w:rPr>
+                <w:szCs w:val="18"/>
+              </w:rPr>
+            </w:pPr>
+          </w:p>
+        </w:tc>
+        <w:tc>
+          <w:tcPr>
+            <w:tcW w:w="943" w:type="pct"/>
+          </w:tcPr>
+          <w:p>
+            <w:pPr>
+              <w:rPr>
+                <w:szCs w:val="18"/>
+              </w:rPr>
+            </w:pPr>
+            <w:r>
+              <w:rPr>
+                <w:szCs w:val="18"/>
+              </w:rPr>
+              <w:t>[…]</w:t>
+            </w:r>
+          </w:p>
+        </w:tc>
+        <w:tc>
+          <w:tcPr>
+            <w:tcW w:w="550" w:type="pct"/>
+          </w:tcPr>
+          <w:p>
+            <w:pPr>
+              <w:rPr>
+                <w:szCs w:val="18"/>
+              </w:rPr>
+            </w:pPr>
+          </w:p>
+        </w:tc>
+        <w:tc>
+          <w:tcPr>
+            <w:tcW w:w="1101" w:type="pct"/>
+          </w:tcPr>
+          <w:p>
+            <w:pPr>
+              <w:rPr>
+                <w:szCs w:val="18"/>
+              </w:rPr>
+            </w:pPr>
+          </w:p>
+        </w:tc>
+        <w:tc>
+          <w:tcPr>
+            <w:tcW w:w="1701" w:type="pct"/>
+          </w:tcPr>
+          <w:p>
+            <w:pPr>
+              <w:rPr>
+                <w:szCs w:val="18"/>
+              </w:rPr>
+            </w:pPr>
+          </w:p>
+        </w:tc>
+      </w:tr>
+      <w:tr>
+        <w:tc>
+          <w:tcPr>
+            <w:tcW w:w="705" w:type="pct"/>
+          </w:tcPr>
+          <w:p>
+            <w:pPr>
+              <w:jc w:val="right"/>
+              <w:rPr>
+                <w:szCs w:val="18"/>
+              </w:rPr>
+            </w:pPr>
+            <w:r>
+              <w:rPr>
+                <w:szCs w:val="18"/>
+              </w:rPr>
+              <w:t>8</w:t>
+            </w:r>
+            <w:r>
+              <w:rPr>
+                <w:szCs w:val="18"/>
+              </w:rPr>
+              <w:t>+12×n</w:t>
+            </w:r>
+          </w:p>
+        </w:tc>
+        <w:tc>
+          <w:tcPr>
+            <w:tcW w:w="943" w:type="pct"/>
+          </w:tcPr>
+          <w:p>
+            <w:pPr>
+              <w:rPr>
+                <w:szCs w:val="18"/>
+              </w:rPr>
+            </w:pPr>
+            <w:r>
+              <w:rPr>
+                <w:szCs w:val="18"/>
+              </w:rPr>
+              <w:t>CRC</w:t>
+            </w:r>
+          </w:p>
+        </w:tc>
+        <w:tc>
+          <w:tcPr>
+            <w:tcW w:w="550" w:type="pct"/>
+          </w:tcPr>
+          <w:p>
+            <w:pPr>
+              <w:rPr>
+                <w:szCs w:val="18"/>
+              </w:rPr>
+            </w:pPr>
+            <w:r>
+              <w:rPr>
+                <w:szCs w:val="18"/>
+              </w:rPr>
+              <w:t>Uint16</w:t>
+            </w:r>
+          </w:p>
+        </w:tc>
+        <w:tc>
+          <w:tcPr>
+            <w:tcW w:w="1101" w:type="pct"/>
+          </w:tcPr>
+          <w:p>
+            <w:pPr>
+              <w:rPr>
+                <w:szCs w:val="18"/>
+              </w:rPr>
+            </w:pPr>
+          </w:p>
+        </w:tc>
+        <w:tc>
+          <w:tcPr>
+            <w:tcW w:w="1701" w:type="pct"/>
+          </w:tcPr>
+          <w:p>
+            <w:pPr>
+              <w:rPr>
+                <w:szCs w:val="18"/>
+              </w:rPr>
+            </w:pPr>
+            <w:r>
+              <w:rPr>
+                <w:szCs w:val="18"/>
+              </w:rPr>
+              <w:t>CCITT</w:t>
+            </w:r>
+          </w:p>
+        </w:tc>
+      </w:tr>
+    </w:tbl>
+    <w:p>
+      <w:pPr>
+        <w:pStyle w:val="Titulek"/>
+        <w:keepNext/>
+      </w:pPr>
+      <w:bookmarkStart w:id="22" w:name="_Ref224286613"/>
+      <w:r>
+        <w:t xml:space="preserve">Table </w:t>
+      </w:r>
+      <w:r>
+        <w:fldChar w:fldCharType="begin"/>
+      </w:r>
+      <w:r>
+        <w:instrText xml:space="preserve"> SEQ Table \* ARABIC </w:instrText>
+      </w:r>
+      <w:r>
+        <w:fldChar w:fldCharType="separate"/>
+      </w:r>
+      <w:r>
+        <w:rPr>
+          <w:noProof/>
+        </w:rPr>
+        <w:t>23</w:t>
+      </w:r>
+      <w:r>
+        <w:fldChar w:fldCharType="end"/>
+      </w:r>
+      <w:r>
+        <w:t xml:space="preserve"> </w:t>
+      </w:r>
+      <w:r>
+        <w:t>Response</w:t>
+      </w:r>
+      <w:r>
+        <w:t xml:space="preserve"> to </w:t>
+      </w:r>
+      <w:r>
+        <w:t>Set calibration command</w:t>
+      </w:r>
+      <w:bookmarkEnd w:id="22"/>
+    </w:p>
+    <w:tbl>
+      <w:tblPr>
+        <w:tblStyle w:val="Mkatabulky"/>
+        <w:tblW w:w="5000" w:type="pct"/>
+        <w:tblLook w:val="04A0" w:firstRow="1" w:lastRow="0" w:firstColumn="1" w:lastColumn="0" w:noHBand="0" w:noVBand="1"/>
+      </w:tblPr>
+      <w:tblGrid>
+        <w:gridCol w:w="1448"/>
+        <w:gridCol w:w="1470"/>
+        <w:gridCol w:w="968"/>
+        <w:gridCol w:w="1223"/>
+        <w:gridCol w:w="4627"/>
+      </w:tblGrid>
+      <w:tr>
+        <w:trPr>
+          <w:tblHeader/>
+        </w:trPr>
+        <w:tc>
+          <w:tcPr>
+            <w:tcW w:w="744" w:type="pct"/>
+          </w:tcPr>
+          <w:p>
+            <w:pPr>
+              <w:rPr>
+                <w:szCs w:val="18"/>
+              </w:rPr>
+            </w:pPr>
+            <w:r>
+              <w:rPr>
+                <w:b/>
+                <w:bCs/>
+                <w:szCs w:val="18"/>
+              </w:rPr>
+              <w:t>Byte offset</w:t>
+            </w:r>
+          </w:p>
+        </w:tc>
+        <w:tc>
+          <w:tcPr>
+            <w:tcW w:w="755" w:type="pct"/>
+          </w:tcPr>
+          <w:p>
+            <w:pPr>
+              <w:rPr>
+                <w:szCs w:val="18"/>
+              </w:rPr>
+            </w:pPr>
+            <w:r>
+              <w:rPr>
+                <w:b/>
+                <w:bCs/>
+                <w:szCs w:val="18"/>
+              </w:rPr>
+              <w:t>Field</w:t>
+            </w:r>
+          </w:p>
+        </w:tc>
+        <w:tc>
+          <w:tcPr>
+            <w:tcW w:w="497" w:type="pct"/>
+          </w:tcPr>
+          <w:p>
+            <w:pPr>
+              <w:rPr>
+                <w:szCs w:val="18"/>
+              </w:rPr>
+            </w:pPr>
+            <w:r>
+              <w:rPr>
+                <w:b/>
+                <w:bCs/>
+                <w:szCs w:val="18"/>
+              </w:rPr>
+              <w:t>Type</w:t>
+            </w:r>
+          </w:p>
+        </w:tc>
+        <w:tc>
+          <w:tcPr>
+            <w:tcW w:w="628" w:type="pct"/>
+          </w:tcPr>
+          <w:p>
+            <w:pPr>
+              <w:rPr>
+                <w:szCs w:val="18"/>
+              </w:rPr>
+            </w:pPr>
+            <w:r>
+              <w:rPr>
+                <w:b/>
+                <w:bCs/>
+                <w:szCs w:val="18"/>
+              </w:rPr>
+              <w:t>Example</w:t>
+            </w:r>
+          </w:p>
+        </w:tc>
+        <w:tc>
+          <w:tcPr>
+            <w:tcW w:w="2376" w:type="pct"/>
+          </w:tcPr>
+          <w:p>
+            <w:pPr>
+              <w:rPr>
+                <w:szCs w:val="18"/>
+              </w:rPr>
+            </w:pPr>
+            <w:r>
+              <w:rPr>
+                <w:b/>
+                <w:bCs/>
+                <w:szCs w:val="18"/>
+              </w:rPr>
+              <w:t>Note</w:t>
+            </w:r>
+          </w:p>
+        </w:tc>
+      </w:tr>
+      <w:tr>
+        <w:tc>
+          <w:tcPr>
+            <w:tcW w:w="744" w:type="pct"/>
+          </w:tcPr>
+          <w:p>
+            <w:pPr>
+              <w:jc w:val="right"/>
+              <w:rPr>
+                <w:szCs w:val="18"/>
+              </w:rPr>
+            </w:pPr>
+            <w:r>
+              <w:rPr>
+                <w:szCs w:val="18"/>
+              </w:rPr>
+              <w:t>0</w:t>
+            </w:r>
+          </w:p>
+        </w:tc>
+        <w:tc>
+          <w:tcPr>
+            <w:tcW w:w="755" w:type="pct"/>
+          </w:tcPr>
+          <w:p>
+            <w:pPr>
+              <w:rPr>
+                <w:szCs w:val="18"/>
+              </w:rPr>
+            </w:pPr>
+            <w:r>
+              <w:rPr>
+                <w:szCs w:val="18"/>
+              </w:rPr>
+              <w:t>Packet type</w:t>
+            </w:r>
+          </w:p>
+        </w:tc>
+        <w:tc>
+          <w:tcPr>
+            <w:tcW w:w="497" w:type="pct"/>
+          </w:tcPr>
+          <w:p>
+            <w:pPr>
+              <w:rPr>
+                <w:szCs w:val="18"/>
+              </w:rPr>
+            </w:pPr>
+            <w:r>
+              <w:rPr>
+                <w:szCs w:val="18"/>
+              </w:rPr>
+              <w:t>Uint16</w:t>
+            </w:r>
+          </w:p>
+        </w:tc>
+        <w:tc>
+          <w:tcPr>
+            <w:tcW w:w="628" w:type="pct"/>
+          </w:tcPr>
+          <w:p>
+            <w:pPr>
+              <w:rPr>
+                <w:szCs w:val="18"/>
+              </w:rPr>
+            </w:pPr>
+            <w:r>
+              <w:rPr>
+                <w:szCs w:val="18"/>
+              </w:rPr>
+              <w:t>0</w:t>
+            </w:r>
+          </w:p>
+        </w:tc>
+        <w:tc>
+          <w:tcPr>
+            <w:tcW w:w="2376" w:type="pct"/>
+          </w:tcPr>
+          <w:p>
+            <w:pPr>
+              <w:rPr>
+                <w:szCs w:val="18"/>
+              </w:rPr>
+            </w:pPr>
+            <w:r>
+              <w:rPr>
+                <w:szCs w:val="18"/>
+              </w:rPr>
+              <w:t>Fixed value</w:t>
+            </w:r>
+          </w:p>
+        </w:tc>
+      </w:tr>
+      <w:tr>
+        <w:tc>
+          <w:tcPr>
+            <w:tcW w:w="744" w:type="pct"/>
+          </w:tcPr>
+          <w:p>
+            <w:pPr>
+              <w:jc w:val="right"/>
+              <w:rPr>
+                <w:szCs w:val="18"/>
+              </w:rPr>
+            </w:pPr>
+            <w:r>
+              <w:rPr>
+                <w:szCs w:val="18"/>
+              </w:rPr>
+              <w:t>2</w:t>
+            </w:r>
+          </w:p>
+        </w:tc>
+        <w:tc>
+          <w:tcPr>
+            <w:tcW w:w="755" w:type="pct"/>
+          </w:tcPr>
+          <w:p>
+            <w:pPr>
+              <w:rPr>
+                <w:szCs w:val="18"/>
+              </w:rPr>
+            </w:pPr>
+            <w:r>
+              <w:rPr>
+                <w:szCs w:val="18"/>
+              </w:rPr>
+              <w:t>Error</w:t>
+            </w:r>
+          </w:p>
+        </w:tc>
+        <w:tc>
+          <w:tcPr>
+            <w:tcW w:w="497" w:type="pct"/>
+          </w:tcPr>
+          <w:p>
+            <w:pPr>
+              <w:rPr>
+                <w:szCs w:val="18"/>
+              </w:rPr>
+            </w:pPr>
+            <w:r>
+              <w:rPr>
+                <w:szCs w:val="18"/>
+              </w:rPr>
+              <w:t>Uint16</w:t>
+            </w:r>
+          </w:p>
+        </w:tc>
+        <w:tc>
+          <w:tcPr>
+            <w:tcW w:w="628" w:type="pct"/>
+          </w:tcPr>
+          <w:p>
+            <w:pPr>
+              <w:rPr>
+                <w:szCs w:val="18"/>
+              </w:rPr>
+            </w:pPr>
+            <w:r>
+              <w:rPr>
+                <w:szCs w:val="18"/>
+              </w:rPr>
+              <w:t>0</w:t>
+            </w:r>
+          </w:p>
+        </w:tc>
+        <w:tc>
+          <w:tcPr>
+            <w:tcW w:w="2376" w:type="pct"/>
+          </w:tcPr>
+          <w:p>
+            <w:pPr>
+              <w:rPr>
+                <w:szCs w:val="18"/>
+              </w:rPr>
+            </w:pPr>
+            <w:r>
+              <w:rPr>
+                <w:szCs w:val="18"/>
+              </w:rPr>
+              <w:t>0 = No error (ack); (Mainly as padding)</w:t>
+            </w:r>
+          </w:p>
+        </w:tc>
+      </w:tr>
+      <w:tr>
+        <w:tc>
+          <w:tcPr>
+            <w:tcW w:w="744" w:type="pct"/>
+          </w:tcPr>
+          <w:p>
+            <w:pPr>
+              <w:jc w:val="right"/>
+              <w:rPr>
+                <w:szCs w:val="18"/>
+              </w:rPr>
+            </w:pPr>
+            <w:r>
+              <w:rPr>
+                <w:szCs w:val="18"/>
+              </w:rPr>
+              <w:t>4</w:t>
+            </w:r>
+          </w:p>
+        </w:tc>
+        <w:tc>
+          <w:tcPr>
+            <w:tcW w:w="755" w:type="pct"/>
+          </w:tcPr>
+          <w:p>
+            <w:pPr>
+              <w:rPr>
+                <w:szCs w:val="18"/>
+              </w:rPr>
+            </w:pPr>
+            <w:r>
+              <w:rPr>
+                <w:szCs w:val="18"/>
+              </w:rPr>
+              <w:t>CMD</w:t>
+            </w:r>
+          </w:p>
+        </w:tc>
+        <w:tc>
+          <w:tcPr>
+            <w:tcW w:w="497" w:type="pct"/>
+          </w:tcPr>
+          <w:p>
+            <w:pPr>
+              <w:rPr>
+                <w:szCs w:val="18"/>
+              </w:rPr>
+            </w:pPr>
+            <w:r>
+              <w:rPr>
+                <w:szCs w:val="18"/>
+              </w:rPr>
+              <w:t>Uint32</w:t>
+            </w:r>
+          </w:p>
+        </w:tc>
+        <w:tc>
+          <w:tcPr>
+            <w:tcW w:w="628" w:type="pct"/>
+          </w:tcPr>
+          <w:p>
+            <w:pPr>
+              <w:rPr>
+                <w:szCs w:val="18"/>
+              </w:rPr>
+            </w:pPr>
+            <w:r>
+              <w:rPr>
+                <w:szCs w:val="18"/>
+              </w:rPr>
+              <w:t>1</w:t>
+            </w:r>
+            <w:r>
+              <w:rPr>
+                <w:szCs w:val="18"/>
+              </w:rPr>
+              <w:t>6</w:t>
+            </w:r>
+          </w:p>
+        </w:tc>
+        <w:tc>
+          <w:tcPr>
+            <w:tcW w:w="2376" w:type="pct"/>
+          </w:tcPr>
+          <w:p>
+            <w:pPr>
+              <w:rPr>
+                <w:szCs w:val="18"/>
+              </w:rPr>
+            </w:pPr>
+            <w:r>
+              <w:rPr>
+                <w:szCs w:val="18"/>
+              </w:rPr>
+              <w:t>Original CMD</w:t>
+            </w:r>
+          </w:p>
+        </w:tc>
+      </w:tr>
+      <w:tr>
+        <w:tc>
+          <w:tcPr>
+            <w:tcW w:w="744" w:type="pct"/>
+          </w:tcPr>
+          <w:p>
+            <w:pPr>
+              <w:jc w:val="right"/>
+              <w:rPr>
+                <w:szCs w:val="18"/>
+              </w:rPr>
+            </w:pPr>
+            <w:r>
+              <w:rPr>
+                <w:szCs w:val="18"/>
+              </w:rPr>
+              <w:t>8</w:t>
+            </w:r>
+          </w:p>
+        </w:tc>
+        <w:tc>
+          <w:tcPr>
+            <w:tcW w:w="755" w:type="pct"/>
+          </w:tcPr>
+          <w:p>
+            <w:pPr>
+              <w:rPr>
+                <w:szCs w:val="18"/>
+              </w:rPr>
+            </w:pPr>
+            <w:r>
+              <w:rPr>
+                <w:szCs w:val="18"/>
+              </w:rPr>
+              <w:t>Save ack</w:t>
+            </w:r>
+          </w:p>
+        </w:tc>
+        <w:tc>
+          <w:tcPr>
+            <w:tcW w:w="497" w:type="pct"/>
+          </w:tcPr>
+          <w:p>
+            <w:pPr>
+              <w:rPr>
+                <w:szCs w:val="18"/>
+              </w:rPr>
+            </w:pPr>
+            <w:r>
+              <w:rPr>
+                <w:szCs w:val="18"/>
+              </w:rPr>
+              <w:t>Uint</w:t>
+            </w:r>
+            <w:r>
+              <w:rPr>
+                <w:szCs w:val="18"/>
+              </w:rPr>
+              <w:t>8</w:t>
+            </w:r>
+          </w:p>
+        </w:tc>
+        <w:tc>
+          <w:tcPr>
+            <w:tcW w:w="628" w:type="pct"/>
+          </w:tcPr>
+          <w:p>
+            <w:pPr>
+              <w:rPr>
+                <w:szCs w:val="18"/>
+              </w:rPr>
+            </w:pPr>
+            <w:r>
+              <w:rPr>
+                <w:szCs w:val="18"/>
+              </w:rPr>
+              <w:t>0</w:t>
+            </w:r>
+          </w:p>
+        </w:tc>
+        <w:tc>
+          <w:tcPr>
+            <w:tcW w:w="2376" w:type="pct"/>
+          </w:tcPr>
+          <w:p>
+            <w:pPr>
+              <w:rPr>
+                <w:szCs w:val="18"/>
+              </w:rPr>
+            </w:pPr>
+            <w:r>
+              <w:rPr>
+                <w:szCs w:val="18"/>
+              </w:rPr>
+              <w:t xml:space="preserve">0 = successfully stored in EEPROM, </w:t>
+            </w:r>
+            <w:r>
+              <w:rPr>
+                <w:szCs w:val="18"/>
+              </w:rPr>
+              <w:t>error otherwise</w:t>
             </w:r>
           </w:p>
         </w:tc>
@@ -17737,7 +19402,7 @@
         <w:rPr>
           <w:noProof/>
         </w:rPr>
-        <w:t>22</w:t>
+        <w:t>24</w:t>
       </w:r>
       <w:r>
         <w:fldChar w:fldCharType="end"/>
@@ -18694,7 +20359,7 @@
         <w:rPr>
           <w:noProof/>
         </w:rPr>
-        <w:t>23</w:t>
+        <w:t>25</w:t>
       </w:r>
       <w:r>
         <w:fldChar w:fldCharType="end"/>
@@ -19506,59 +21171,13 @@
                 <w:szCs w:val="18"/>
               </w:rPr>
             </w:pPr>
-            <w:proofErr w:type="spellStart"/>
             <w:r>
               <w:rPr>
                 <w:b/>
                 <w:bCs/>
                 <w:szCs w:val="18"/>
               </w:rPr>
-              <w:t>Adresa</w:t>
-            </w:r>
-            <w:proofErr w:type="spellEnd"/>
-            <w:r>
-              <w:rPr>
-                <w:b/>
-                <w:bCs/>
-                <w:szCs w:val="18"/>
-              </w:rPr>
-              <w:t xml:space="preserve"> </w:t>
-            </w:r>
-            <w:proofErr w:type="spellStart"/>
-            <w:r>
-              <w:rPr>
-                <w:b/>
-                <w:bCs/>
-                <w:szCs w:val="18"/>
-              </w:rPr>
-              <w:t>generátoru</w:t>
-            </w:r>
-            <w:proofErr w:type="spellEnd"/>
-            <w:r>
-              <w:rPr>
-                <w:b/>
-                <w:bCs/>
-                <w:szCs w:val="18"/>
-              </w:rPr>
-              <w:t xml:space="preserve"> </w:t>
-            </w:r>
-            <w:proofErr w:type="spellStart"/>
-            <w:r>
-              <w:rPr>
-                <w:b/>
-                <w:bCs/>
-                <w:szCs w:val="18"/>
-              </w:rPr>
-              <w:t>taxtové</w:t>
-            </w:r>
-            <w:proofErr w:type="spellEnd"/>
-            <w:r>
-              <w:rPr>
-                <w:b/>
-                <w:bCs/>
-                <w:szCs w:val="18"/>
-              </w:rPr>
-              <w:t xml:space="preserve"> pole</w:t>
+              <w:t>Adresa generátoru taxtové pole</w:t>
             </w:r>
           </w:p>
         </w:tc>
@@ -19622,34 +21241,14 @@
                 <w:szCs w:val="18"/>
               </w:rPr>
             </w:pPr>
-            <w:proofErr w:type="spellStart"/>
             <w:r>
               <w:rPr>
                 <w:b/>
                 <w:bCs/>
                 <w:szCs w:val="18"/>
               </w:rPr>
-              <w:t>Systémové</w:t>
-            </w:r>
-            <w:proofErr w:type="spellEnd"/>
-            <w:r>
-              <w:rPr>
-                <w:b/>
-                <w:bCs/>
-                <w:szCs w:val="18"/>
-              </w:rPr>
-              <w:t xml:space="preserve"> </w:t>
-            </w:r>
-            <w:proofErr w:type="spellStart"/>
-            <w:r>
-              <w:rPr>
-                <w:b/>
-                <w:bCs/>
-                <w:szCs w:val="18"/>
-              </w:rPr>
-              <w:t>zprávy</w:t>
-            </w:r>
-            <w:proofErr w:type="spellEnd"/>
+              <w:t>Systémové zprávy</w:t>
+            </w:r>
           </w:p>
         </w:tc>
       </w:tr>
@@ -19670,7 +21269,6 @@
                 <w:szCs w:val="18"/>
               </w:rPr>
             </w:pPr>
-            <w:proofErr w:type="spellStart"/>
             <w:r>
               <w:rPr>
                 <w:b/>
@@ -19679,7 +21277,6 @@
               </w:rPr>
               <w:t>Potvrdit</w:t>
             </w:r>
-            <w:proofErr w:type="spellEnd"/>
           </w:p>
         </w:tc>
         <w:tc>
@@ -19695,121 +21292,37 @@
                 <w:szCs w:val="18"/>
               </w:rPr>
             </w:pPr>
-            <w:proofErr w:type="spellStart"/>
             <w:r>
               <w:rPr>
                 <w:b/>
                 <w:bCs/>
                 <w:szCs w:val="18"/>
               </w:rPr>
-              <w:t>Registrer</w:t>
-            </w:r>
-            <w:proofErr w:type="spellEnd"/>
-            <w:r>
+              <w:t>Registrer receiver textové pole</w:t>
+            </w:r>
+          </w:p>
+        </w:tc>
+        <w:tc>
+          <w:tcPr>
+            <w:tcW w:w="2254" w:type="dxa"/>
+            <w:gridSpan w:val="2"/>
+          </w:tcPr>
+          <w:p>
+            <w:pPr>
               <w:rPr>
                 <w:b/>
                 <w:bCs/>
                 <w:szCs w:val="18"/>
               </w:rPr>
-              <w:t xml:space="preserve"> receiver </w:t>
-            </w:r>
-            <w:proofErr w:type="spellStart"/>
+            </w:pPr>
             <w:r>
               <w:rPr>
                 <w:b/>
                 <w:bCs/>
                 <w:szCs w:val="18"/>
               </w:rPr>
-              <w:t>textové</w:t>
-            </w:r>
-            <w:proofErr w:type="spellEnd"/>
-            <w:r>
-              <w:rPr>
-                <w:b/>
-                <w:bCs/>
-                <w:szCs w:val="18"/>
-              </w:rPr>
-              <w:t xml:space="preserve"> pole</w:t>
-            </w:r>
-          </w:p>
-        </w:tc>
-        <w:tc>
-          <w:tcPr>
-            <w:tcW w:w="2254" w:type="dxa"/>
-            <w:gridSpan w:val="2"/>
-          </w:tcPr>
-          <w:p>
-            <w:pPr>
-              <w:rPr>
-                <w:b/>
-                <w:bCs/>
-                <w:szCs w:val="18"/>
-              </w:rPr>
-            </w:pPr>
-            <w:proofErr w:type="spellStart"/>
-            <w:r>
-              <w:rPr>
-                <w:b/>
-                <w:bCs/>
-                <w:szCs w:val="18"/>
-              </w:rPr>
-              <w:t>Výpis</w:t>
-            </w:r>
-            <w:proofErr w:type="spellEnd"/>
-            <w:r>
-              <w:rPr>
-                <w:b/>
-                <w:bCs/>
-                <w:szCs w:val="18"/>
-              </w:rPr>
-              <w:t xml:space="preserve"> </w:t>
-            </w:r>
-            <w:proofErr w:type="spellStart"/>
-            <w:r>
-              <w:rPr>
-                <w:b/>
-                <w:bCs/>
-                <w:szCs w:val="18"/>
-              </w:rPr>
-              <w:t>cesty</w:t>
-            </w:r>
-            <w:proofErr w:type="spellEnd"/>
-            <w:r>
-              <w:rPr>
-                <w:b/>
-                <w:bCs/>
-                <w:szCs w:val="18"/>
-              </w:rPr>
-              <w:t xml:space="preserve"> </w:t>
-            </w:r>
-            <w:proofErr w:type="spellStart"/>
-            <w:r>
-              <w:rPr>
-                <w:b/>
-                <w:bCs/>
-                <w:szCs w:val="18"/>
-              </w:rPr>
-              <w:t>kam</w:t>
-            </w:r>
-            <w:proofErr w:type="spellEnd"/>
-            <w:r>
-              <w:rPr>
-                <w:b/>
-                <w:bCs/>
-                <w:szCs w:val="18"/>
-              </w:rPr>
-              <w:t xml:space="preserve"> </w:t>
-            </w:r>
-            <w:proofErr w:type="spellStart"/>
-            <w:r>
-              <w:rPr>
-                <w:b/>
-                <w:bCs/>
-                <w:szCs w:val="18"/>
-              </w:rPr>
-              <w:t>ukládám</w:t>
-            </w:r>
-            <w:proofErr w:type="spellEnd"/>
+              <w:t>Výpis cesty kam ukládám</w:t>
+            </w:r>
           </w:p>
         </w:tc>
         <w:tc>
@@ -19846,59 +21359,13 @@
                 <w:szCs w:val="18"/>
               </w:rPr>
             </w:pPr>
-            <w:proofErr w:type="spellStart"/>
             <w:r>
               <w:rPr>
                 <w:b/>
                 <w:bCs/>
                 <w:szCs w:val="18"/>
               </w:rPr>
-              <w:t>Adresa</w:t>
-            </w:r>
-            <w:proofErr w:type="spellEnd"/>
-            <w:r>
-              <w:rPr>
-                <w:b/>
-                <w:bCs/>
-                <w:szCs w:val="18"/>
-              </w:rPr>
-              <w:t xml:space="preserve"> </w:t>
-            </w:r>
-            <w:proofErr w:type="spellStart"/>
-            <w:r>
-              <w:rPr>
-                <w:b/>
-                <w:bCs/>
-                <w:szCs w:val="18"/>
-              </w:rPr>
-              <w:t>klienta</w:t>
-            </w:r>
-            <w:proofErr w:type="spellEnd"/>
-            <w:r>
-              <w:rPr>
-                <w:b/>
-                <w:bCs/>
-                <w:szCs w:val="18"/>
-              </w:rPr>
-              <w:t xml:space="preserve"> </w:t>
-            </w:r>
-            <w:proofErr w:type="spellStart"/>
-            <w:r>
-              <w:rPr>
-                <w:b/>
-                <w:bCs/>
-                <w:szCs w:val="18"/>
-              </w:rPr>
-              <w:t>textové</w:t>
-            </w:r>
-            <w:proofErr w:type="spellEnd"/>
-            <w:r>
-              <w:rPr>
-                <w:b/>
-                <w:bCs/>
-                <w:szCs w:val="18"/>
-              </w:rPr>
-              <w:t xml:space="preserve"> pole</w:t>
+              <w:t>Adresa klienta textové pole</w:t>
             </w:r>
           </w:p>
         </w:tc>
@@ -19982,7 +21449,6 @@
                 <w:szCs w:val="18"/>
               </w:rPr>
             </w:pPr>
-            <w:proofErr w:type="spellStart"/>
             <w:r>
               <w:rPr>
                 <w:b/>
@@ -19991,7 +21457,6 @@
               </w:rPr>
               <w:t>Potvrdit</w:t>
             </w:r>
-            <w:proofErr w:type="spellEnd"/>
           </w:p>
         </w:tc>
         <w:tc>
@@ -20013,25 +21478,7 @@
                 <w:bCs/>
                 <w:szCs w:val="18"/>
               </w:rPr>
-              <w:t xml:space="preserve">Remove receiver </w:t>
-            </w:r>
-            <w:proofErr w:type="spellStart"/>
-            <w:r>
-              <w:rPr>
-                <w:b/>
-                <w:bCs/>
-                <w:szCs w:val="18"/>
-              </w:rPr>
-              <w:t>textové</w:t>
-            </w:r>
-            <w:proofErr w:type="spellEnd"/>
-            <w:r>
-              <w:rPr>
-                <w:b/>
-                <w:bCs/>
-                <w:szCs w:val="18"/>
-              </w:rPr>
-              <w:t xml:space="preserve"> pole</w:t>
+              <w:t>Remove receiver textové pole</w:t>
             </w:r>
           </w:p>
         </w:tc>
@@ -20249,10 +21696,6 @@
     </w:sectPr>
   </w:body>
 </w:document>
-</file>
-
-<file path=word/numbering.xml><?xml version="1.0" encoding="utf-8"?>
-<w:numbering xmlns:wpc="http://schemas.microsoft.com/office/word/2010/wordprocessingCanvas" xmlns:cx="http://schemas.microsoft.com/office/drawing/2014/chartex" xmlns:cx1="http://schemas.microsoft.com/office/drawing/2015/9/8/chartex" xmlns:cx2="http://schemas.microsoft.com/office/drawing/2015/10/21/chartex" xmlns:cx3="http://schemas.microsoft.com/office/drawing/2016/5/9/chartex" xmlns:cx4="http://schemas.microsoft.com/office/drawing/2016/5/10/chartex" xmlns:cx5="http://schemas.microsoft.com/office/drawing/2016/5/11/chartex" xmlns:cx6="http://schemas.microsoft.com/office/drawing/2016/5/12/chartex" xmlns:cx7="http://schemas.microsoft.com/office/drawing/2016/5/13/chartex" xmlns:cx8="http://schemas.microsoft.com/office/drawing/2016/5/14/chartex" xmlns:mc="http://schemas.openxmlformats.org/markup-compatibility/2006" xmlns:aink="http://schemas.microsoft.com/office/drawing/2016/ink" xmlns:am3d="http://schemas.microsoft.com/office/drawing/2017/model3d" xmlns:o="urn:schemas-microsoft-com:office:office" xmlns:oel="http://schemas.microsoft.com/office/2019/extlst" xmlns:r="http://schemas.openxmlformats.org/officeDocument/2006/relationships" xmlns:m="http://schemas.openxmlformats.org/officeDocument/2006/math" xmlns:v="urn:schemas-microsoft-com:vml" xmlns:wp14="http://schemas.microsoft.com/office/word/2010/wordprocessingDrawing" xmlns:wp="http://schemas.openxmlformats.org/drawingml/2006/wordprocessingDrawing" xmlns:w10="urn:schemas-microsoft-com:office:word" xmlns:w="http://schemas.openxmlformats.org/wordprocessingml/2006/main" xmlns:w14="http://schemas.microsoft.com/office/word/2010/wordml" xmlns:w15="http://schemas.microsoft.com/office/word/2012/wordml" xmlns:w16cex="http://schemas.microsoft.com/office/word/2018/wordml/cex" xmlns:w16cid="http://schemas.microsoft.com/office/word/2016/wordml/cid" xmlns:w16="http://schemas.microsoft.com/office/word/2018/wordml" xmlns:w16du="http://schemas.microsoft.com/office/word/2023/wordml/word16du" xmlns:w16sdtdh="http://schemas.microsoft.com/office/word/2020/wordml/sdtdatahash" xmlns:w16sdtfl="http://schemas.microsoft.com/office/word/2024/wordml/sdtformatlock" xmlns:w16se="http://schemas.microsoft.com/office/word/2015/wordml/symex" xmlns:wpg="http://schemas.microsoft.com/office/word/2010/wordprocessingGroup" xmlns:wpi="http://schemas.microsoft.com/office/word/2010/wordprocessingInk" xmlns:wne="http://schemas.microsoft.com/office/word/2006/wordml" xmlns:wps="http://schemas.microsoft.com/office/word/2010/wordprocessingShape" mc:Ignorable="w14 w15 w16se w16cid w16 w16cex w16sdtdh w16sdtfl w16du wp14"/>
 </file>
 
 <file path=word/styles.xml><?xml version="1.0" encoding="utf-8"?>
@@ -20655,7 +22098,7 @@
   <w:style w:type="paragraph" w:default="1" w:styleId="Normln">
     <w:name w:val="Normal"/>
     <w:qFormat/>
-    <w:rsid w:val="00ED49BF"/>
+    <w:rsid w:val="00817A4D"/>
     <w:rPr>
       <w:sz w:val="18"/>
       <w:lang w:val="en-US"/>

</xml_diff>